<commit_message>
Correct report claims and the shot-allocation figure after a full audit
H1 is partially supported: unmitigated error rises with noise level in
every (n, L) cell but only on average with n and L. The allocation table
and figure I1 now average the five circuit instances per condition instead
of showing the first one. The ZNE variance ratio is reported as within
sampling uncertainty of theory, two literature summaries now match the
papers' abstracts, and the Word report's captions and text match what each
figure shows. Dashboard, field guide and study guide updated to agree.
</commit_message>
<xml_diff>
--- a/dashboard/quantum-error-mitigation-bench/Group20_Report.docx
+++ b/dashboard/quantum-error-mitigation-bench/Group20_Report.docx
@@ -3442,7 +3442,7 @@
                 <w:sz w:val="17"/>
                 <w:szCs w:val="17"/>
               </w:rPr>
-              <w:t xml:space="preserve">Theory with simulated short-depth circuits: extrapolation to zero noise (Richardson) and probabilistic error cancellation.</w:t>
+              <w:t xml:space="preserve">Theory: two schemes for short-depth circuits, extrapolation to the zero-noise limit (Richardson's deferred approach to the limit) and quasi-probability resampling of randomized circuits.</w:t>
             </w:r>
           </w:p>
         </w:tc>
@@ -3472,7 +3472,7 @@
                 <w:sz w:val="17"/>
                 <w:szCs w:val="17"/>
               </w:rPr>
-              <w:t xml:space="preserve">Expectation values can be corrected by measuring at amplified noise and extrapolating. Limitation: theoretical; needs noise that can be scaled in a controlled way.</w:t>
+              <w:t xml:space="preserve">Expectation values can be corrected without extra qubits. Limitation (stated by the authors): the circuit size these schemes can handle is limited by the rate at which errors are introduced.</w:t>
             </w:r>
           </w:p>
         </w:tc>
@@ -3597,7 +3597,7 @@
                 <w:sz w:val="17"/>
                 <w:szCs w:val="17"/>
               </w:rPr>
-              <w:t xml:space="preserve">IBM superconducting hardware: Richardson ZNE on variational chemistry and magnetism problems.</w:t>
+              <w:t xml:space="preserve">Superconducting processor: extrapolation from a collection of experiments at varied noise; single- and two-qubit experiments, then variational optimization of Hamiltonians for chemistry and magnetism.</w:t>
             </w:r>
           </w:p>
         </w:tc>
@@ -3627,7 +3627,7 @@
                 <w:sz w:val="17"/>
                 <w:szCs w:val="17"/>
               </w:rPr>
-              <w:t xml:space="preserve">Mitigation measurably improves accuracy on real hardware with no extra qubits. Limitation: noise is scaled at the pulse level, which needs pulse control; physics tasks only, no classification.</w:t>
+              <w:t xml:space="preserve">Suppressing incoherent errors recovers otherwise inaccessible accuracy with no hardware modifications. Limitation: demonstrated on chemistry and magnetism problems; not applied to a classification task.</w:t>
             </w:r>
           </w:p>
         </w:tc>
@@ -3752,7 +3752,7 @@
                 <w:sz w:val="17"/>
                 <w:szCs w:val="17"/>
               </w:rPr>
-              <w:t xml:space="preserve">Unitary folding U(U†U)ᵏ and parameterized noise scaling; simulations and small hardware benchmarks.</w:t>
+              <w:t xml:space="preserve">Introduces unitary folding U(U†U)ᵏ and parameterized noise scaling (gate-level access only) and compares extrapolation methods, including an adaptive one.</w:t>
             </w:r>
           </w:p>
         </w:tc>
@@ -3782,7 +3782,7 @@
                 <w:sz w:val="17"/>
                 <w:szCs w:val="17"/>
               </w:rPr>
-              <w:t xml:space="preserve">Noise can be scaled purely at the gate level, with no pulse access. Limitation: assumes folded gates add noise proportionally; the variance cost of extrapolation remains.</w:t>
+              <w:t xml:space="preserve">Benchmarks show 18× to 24× error reduction over unmitigated circuits. Limitation (for our setting): folding assumes the added gates scale the noise proportionally, and extrapolation still amplifies shot noise.</w:t>
             </w:r>
           </w:p>
         </w:tc>
@@ -3907,7 +3907,7 @@
                 <w:sz w:val="17"/>
                 <w:szCs w:val="17"/>
               </w:rPr>
-              <w:t xml:space="preserve">IBM Quantum hardware: tensor-product and correlated Markovian readout models; graph states up to 12 qubits, 20-qubit random Clifford states.</w:t>
+              <w:t xml:space="preserve">IBM Quantum hardware: tensor-product and correlated Markovian readout-noise models with rates extracted from calibration data; graph states with n ≤ 12 and 20-qubit random-Clifford states.</w:t>
             </w:r>
           </w:p>
         </w:tc>
@@ -3937,7 +3937,7 @@
                 <w:sz w:val="17"/>
                 <w:szCs w:val="17"/>
               </w:rPr>
-              <w:t xml:space="preserve">A per-qubit (tensor-product) calibration is often an adequate approximation at a fraction of the calibration cost. Limitation: the tensor-product model misses correlated readout errors.</w:t>
+              <w:t xml:space="preserve">Measurement errors can be mitigated by classical post-processing with the inverse noise matrix. Limitation: overhead grows exponentially in εn (ε the maximum error rate); the tensor-product model ignores correlations.</w:t>
             </w:r>
           </w:p>
         </w:tc>
@@ -4062,7 +4062,7 @@
                 <w:sz w:val="17"/>
                 <w:szCs w:val="17"/>
               </w:rPr>
-              <w:t xml:space="preserve">Theory: model output written as a partial Fourier series in the input data.</w:t>
+              <w:t xml:space="preserve">Theory: a quantum model written as a partial Fourier series in the data, with frequencies set by the encoding gates.</w:t>
             </w:r>
           </w:p>
         </w:tc>
@@ -4092,7 +4092,7 @@
                 <w:sz w:val="17"/>
                 <w:szCs w:val="17"/>
               </w:rPr>
-              <w:t xml:space="preserve">A single ry encoding per feature gives only frequencies {−1, 0, +1}; repeated encoding (data re-uploading) is needed for richer functions. Limitation: studies expressivity, not noise or mitigation.</w:t>
+              <w:t xml:space="preserve">Repeating simple encoding gates gives richer frequency spectra; a single ry(x) encoding gives only frequencies {−1, 0, +1}. Limitation (for our setting): concerns expressivity, not noise or mitigation.</w:t>
             </w:r>
           </w:p>
         </w:tc>
@@ -4217,7 +4217,7 @@
                 <w:sz w:val="17"/>
                 <w:szCs w:val="17"/>
               </w:rPr>
-              <w:t xml:space="preserve">Theory: proof for local Pauli noise on layered variational circuits.</w:t>
+              <w:t xml:space="preserve">Theory: proof for a generic ansatz (including QAOA and UCC) under local Pauli noise, with numerical heuristics for QAOA on a realistic noise model.</w:t>
             </w:r>
           </w:p>
         </w:tc>
@@ -4247,7 +4247,7 @@
                 <w:sz w:val="17"/>
                 <w:szCs w:val="17"/>
               </w:rPr>
-              <w:t xml:space="preserve">Gradients vanish exponentially in qubit count when depth grows linearly with it, so noise alone can block training. Limitation: about trainability; does not evaluate inference-time mitigation.</w:t>
+              <w:t xml:space="preserve">Gradients vanish exponentially in qubit count when depth grows linearly with it, so noise alone can block training. Limitation (for our setting): concerns training under noise, whereas we study noise and mitigation at inference time.</w:t>
             </w:r>
           </w:p>
         </w:tc>
@@ -4372,7 +4372,7 @@
                 <w:sz w:val="17"/>
                 <w:szCs w:val="17"/>
               </w:rPr>
-              <w:t xml:space="preserve">Theory: framework linking mitigation to sampling cost, applied to local depolarizing noise.</w:t>
+              <w:t xml:space="preserve">Theory: universal bounds on how far mitigation can reduce error as a function of sampling overhead.</w:t>
             </w:r>
           </w:p>
         </w:tc>
@@ -4402,7 +4402,7 @@
                 <w:sz w:val="17"/>
                 <w:szCs w:val="17"/>
               </w:rPr>
-              <w:t xml:space="preserve">Samples needed for mitigation grow exponentially with depth; PEC is optimal in some settings. Limitation: asymptotic bounds, no empirical side-by-side comparison of specific methods.</w:t>
+              <w:t xml:space="preserve">For local depolarizing noise in layered circuits the sampling overhead grows exponentially with depth; PEC is optimal for local dephasing noise. Limitation (for our setting): theoretical bounds rather than measured performance of specific methods.</w:t>
             </w:r>
           </w:p>
         </w:tc>
@@ -4527,7 +4527,7 @@
                 <w:sz w:val="17"/>
                 <w:szCs w:val="17"/>
               </w:rPr>
-              <w:t xml:space="preserve">Review of ZNE, PEC, readout mitigation, symmetry verification and related methods.</w:t>
+              <w:t xml:space="preserve">Review of proposed mitigation methods, their in-principle efficacy and hardware demonstrations.</w:t>
             </w:r>
           </w:p>
         </w:tc>
@@ -4557,7 +4557,7 @@
                 <w:sz w:val="17"/>
                 <w:szCs w:val="17"/>
               </w:rPr>
-              <w:t xml:space="preserve">The field reduces to a few recurring ideas: scale noise and extrapolate, invert a known channel at a sampling cost, use symmetries to reject bad shots. Limitation: a review; no new controlled, cost-normalized benchmark.</w:t>
+              <w:t xml:space="preserve">Identifies commonalities and limitations, and notes the method should be chosen according to the dominant type of noise. Limitation (for our setting): a review, not a controlled benchmark.</w:t>
             </w:r>
           </w:p>
         </w:tc>
@@ -6039,7 +6039,7 @@
                 <w:sz w:val="18"/>
                 <w:szCs w:val="18"/>
               </w:rPr>
-              <w:t xml:space="preserve">VQC: COBYLA, maxiter = max(300, 25 × parameters): 300 for (n, L) = (2, 2), 400 for (n, L) = (2, 4), 400 for (n, L) = (4, 2), 800 for (n, L) = (4, 4)</w:t>
+              <w:t xml:space="preserve">VQC: COBYLA, maxiter = max(300, 25 × parameters). (n, L) = (2, 2): maxiter 300, 244–300 evaluations used; (n, L) = (2, 4): maxiter 400, 400 evaluations used; (n, L) = (4, 2): maxiter 400, 400 evaluations used; (n, L) = (4, 4): maxiter 800, 800 evaluations used.</w:t>
             </w:r>
           </w:p>
           <w:p>
@@ -6910,7 +6910,7 @@
                 <w:sz w:val="20"/>
                 <w:szCs w:val="20"/>
               </w:rPr>
-              <w:t xml:space="preserve">Seeds 0–4. Data split derive_seed("qml_split", seed); PCA derive_seed("qml_pca", seed); VQC initial weights derive_seed("qml_init", n, L, seed); LR/SVM derive_seed("qml_lr" / "qml_svm", n, seed); simulator and transpiler derive_seed("sim" / "transpile", n, L, noise, seed, purpose).</w:t>
+              <w:t xml:space="preserve">Seeds 0–4. Data split derive_seed("qml_split", seed); PCA derive_seed("qml_pca", seed); VQC initial weights derive_seed("qml_init", n, L, seed); LR/SVM derive_seed("qml_lr" / "qml_svm", n, seed). Track A circuit angles derive_seed("circuit", n, L, seed); simulator and transpiler derive_seed("sim" / "transpile", n, L, noise, seed, purpose) (Track B: "qml_sim" / "qml_transpile").</w:t>
             </w:r>
           </w:p>
         </w:tc>
@@ -7017,7 +7017,7 @@
                 <w:sz w:val="20"/>
                 <w:szCs w:val="20"/>
               </w:rPr>
-              <w:t xml:space="preserve">depolarizing_error(p₁, 1) on ry and rz; depolarizing_error(p₂, 2) on cx; symmetric ReadoutError(p_ro) on every qubit</w:t>
+              <w:t xml:space="preserve">depolarizing_error(p₁, 1) on ry and rz; depolarizing_error(p₂, 2) on cx; symmetric ReadoutError with flip probability p_ro on every qubit</w:t>
             </w:r>
           </w:p>
         </w:tc>
@@ -7085,7 +7085,7 @@
                 <w:sz w:val="20"/>
                 <w:szCs w:val="20"/>
               </w:rPr>
-              <w:t xml:space="preserve">AMD Ryzen 5 7600 (6 cores / 12 threads), 31 GB RAM, Windows 11 Pro; CPU only.</w:t>
+              <w:t xml:space="preserve">AMD Ryzen 5 7600 (6 cores / 12 threads), 31.1 GB RAM as reported by Windows, Windows 11 Pro; CPU only.</w:t>
             </w:r>
           </w:p>
           <w:p>
@@ -7635,7 +7635,7 @@
           <w:sz w:val="16"/>
           <w:szCs w:val="16"/>
         </w:rPr>
-        <w:t xml:space="preserve">pytest -q                                                             # 186 passed tests</w:t>
+        <w:t xml:space="preserve">pytest -q                                                             # 186 tests</w:t>
       </w:r>
     </w:p>
     <w:p>
@@ -7648,7 +7648,7 @@
           <w:sz w:val="22"/>
           <w:szCs w:val="22"/>
         </w:rPr>
-        <w:t xml:space="preserve">The 186 tests check, among other things, that folded circuits have the same statevector and exactly λ times the gates, the Richardson weights, that REM recovers the exact value within 4σ where no mitigation does not, the overhead formulas, that preprocessing never sees test data, and that a rerun reproduces every output byte for byte.</w:t>
+        <w:t xml:space="preserve">The 186 tests check, among other things, that folded circuits have the same statevector and exactly λ times the gates, the Richardson weights, that with readout-only noise REM recovers the exact value within 4σ where no mitigation does not, the overhead formulas, that preprocessing never sees test data, and that a rerun reproduces runs.csv exactly (apart from the two wall-clock columns) and every raw counts, circuit and calibration file byte for byte.</w:t>
       </w:r>
     </w:p>
     <w:p>
@@ -8065,6 +8065,22 @@
           <w:szCs w:val="16"/>
         </w:rPr>
         <w:t xml:space="preserve">        else:</w:t>
+      </w:r>
+    </w:p>
+    <w:p>
+      <w:pPr>
+        <w:keepNext/>
+        <w:keepLines/>
+        <w:shd w:val="clear" w:color="auto" w:fill="F2F2F2"/>
+        <w:spacing w:after="0" w:before="0" w:line="240" w:lineRule="auto"/>
+      </w:pPr>
+      <w:r>
+        <w:rPr>
+          <w:rFonts w:ascii="Consolas" w:cs="Consolas" w:eastAsia="Consolas" w:hAnsi="Consolas"/>
+          <w:sz w:val="16"/>
+          <w:szCs w:val="16"/>
+        </w:rPr>
+        <w:t xml:space="preserve">            self._sims[name] = AerSimulator(method=cfg.simulator.method, noise_model=nm)</w:t>
       </w:r>
     </w:p>
     <w:p>
@@ -8941,7 +8957,7 @@
                 <w:sz w:val="18"/>
                 <w:szCs w:val="18"/>
               </w:rPr>
-              <w:t xml:space="preserve">Track A: 5 seeds × 5 methods. Track B: VQC on 2 PCA features, COBYLA 300 iterations, 4 mitigation methods.</w:t>
+              <w:t xml:space="preserve">Track A: 5 seeds × 5 methods. Track B: VQC on 2 PCA features, COBYLA maxiter 300 (244–300 evaluations used), 4 mitigation methods.</w:t>
             </w:r>
           </w:p>
         </w:tc>
@@ -9134,7 +9150,7 @@
                 <w:sz w:val="18"/>
                 <w:szCs w:val="18"/>
               </w:rPr>
-              <w:t xml:space="preserve">Track A as E1. Track B: VQC, COBYLA 400 iterations.</w:t>
+              <w:t xml:space="preserve">Track A as E1. Track B: VQC, COBYLA maxiter 400 (400 used).</w:t>
             </w:r>
           </w:p>
         </w:tc>
@@ -9327,7 +9343,7 @@
                 <w:sz w:val="18"/>
                 <w:szCs w:val="18"/>
               </w:rPr>
-              <w:t xml:space="preserve">Track A as E1. Track B: VQC on all 4 features, COBYLA 400 iterations.</w:t>
+              <w:t xml:space="preserve">Track A as E1. Track B: VQC on all 4 features, COBYLA maxiter 400 (400 used).</w:t>
             </w:r>
           </w:p>
         </w:tc>
@@ -9520,7 +9536,7 @@
                 <w:sz w:val="18"/>
                 <w:szCs w:val="18"/>
               </w:rPr>
-              <w:t xml:space="preserve">Track A as E1. Track B: VQC on all 4 features, COBYLA 800 iterations.</w:t>
+              <w:t xml:space="preserve">Track A as E1. Track B: VQC on all 4 features, COBYLA maxiter 800 (800 used).</w:t>
             </w:r>
           </w:p>
         </w:tc>
@@ -10350,7 +10366,7 @@
           <w:sz w:val="20"/>
           <w:szCs w:val="20"/>
         </w:rPr>
-        <w:t xml:space="preserve"> Track A results for E1–E8, mean ± SD over 5 seeds. Primary metric: absolute parity error |E_hat − E_exact| after REM and after ZNE+REM. Secondary metric: Hellinger fidelity of the output distribution, before → after REM. Gate counts and depth: transpiled base circuit / everything ZNE executes (λ = 1, 3, 5). Baseline: no mitigation.</w:t>
+        <w:t xml:space="preserve"> Track A results for E1–E8, mean ± SD over 5 seeds. Primary metric: absolute parity error |E_hat − E_exact| after REM and after ZNE+REM. Secondary metric: Hellinger fidelity of the output distribution, before → after REM. Total gates and two-qubit gates: transpiled base circuit / summed over the three ZNE circuits (λ = 1, 3, 5). Depth: base circuit / deepest ZNE circuit (λ = 5). Baseline: no mitigation.</w:t>
       </w:r>
     </w:p>
     <w:tbl>
@@ -15649,7 +15665,7 @@
           <w:sz w:val="22"/>
           <w:szCs w:val="22"/>
         </w:rPr>
-        <w:t xml:space="preserve">Figure 9 shows the mean absolute error of every method at each noise level: the unmitigated error rises from 0.021 (N0) to 0.062 (N1), 0.181 (N2) and 0.310 (N3), and every mitigated method sits below the baseline at N2 and N3. Figure 10 shows the same error against qubit count at N2, and Figure 11 gives the median improvement for every (n, L) cell.</w:t>
+        <w:t xml:space="preserve">Figure 9 shows the error of every method for each (n, L) at N0–N2 (the N3 stress level is reported separately, in Tables 2 and 4 and results/summary/table_error.md). At N2, every mitigated method is below the baseline in every (n, L) cell; at N0, the ZNE-based methods are worse than the baseline in every cell. Pooled over all circuits, the unmitigated error rises from 0.021 (N0) to 0.062 (N1), 0.181 (N2) and 0.310 (N3). Figure 10 shows the error against qubit count at N2 for each depth, and Figure 11 gives the median improvement for every (n, L) cell at N1 and N2.</w:t>
       </w:r>
     </w:p>
     <w:p>
@@ -15706,7 +15722,7 @@
           <w:sz w:val="18"/>
           <w:szCs w:val="18"/>
         </w:rPr>
-        <w:t xml:space="preserve">Figure 9: Mean absolute parity error by noise level and method (bars: mean over all n, L and seeds).</w:t>
+        <w:t xml:space="preserve">Figure 9: Absolute parity error (mean ± SD over 5 seeds) by noise level (N0–N2) and method, one panel per (n, L); dashed line: mean shot-noise floor.</w:t>
       </w:r>
     </w:p>
     <w:p>
@@ -15763,7 +15779,7 @@
           <w:sz w:val="18"/>
           <w:szCs w:val="18"/>
         </w:rPr>
-        <w:t xml:space="preserve">Figure 10: Absolute error vs. qubit count at N2, by depth and method.</w:t>
+        <w:t xml:space="preserve">Figure 10: Absolute error vs. qubit count at N2, one panel per depth (mean ± SD over 5 seeds).</w:t>
       </w:r>
     </w:p>
     <w:p>
@@ -15820,7 +15836,7 @@
           <w:sz w:val="18"/>
           <w:szCs w:val="18"/>
         </w:rPr>
-        <w:t xml:space="preserve">Figure 11: Median improvement over no mitigation (%) for every (n, L) cell and noise level.</w:t>
+        <w:t xml:space="preserve">Figure 11: Median improvement over no mitigation (%) for every (n, L) cell at N1 and N2 (5 seeds per cell).</w:t>
       </w:r>
     </w:p>
     <w:p>
@@ -15833,7 +15849,7 @@
           <w:sz w:val="22"/>
           <w:szCs w:val="22"/>
         </w:rPr>
-        <w:t xml:space="preserve">Figure 12 compares measured output histograms with the exact distribution for n = 4, L = 4 at N2: noise spreads probability away from the ideal outcomes, and REM moves it back. Figures 13 and 14 quantify this over the whole grid: REM raises Hellinger fidelity in 6/6 (n, L) cells at N2 (mean gain 0.0160) and raises the success-probability ratio toward 1.</w:t>
+        <w:t xml:space="preserve">Figure 12 compares the measured output distribution with the exact one for one circuit (n = 4, L = 4, N2, seed 0): noise spreads probability away from the most likely outcomes, and REM (full and tensored) moves it back. Figures 13 and 14 quantify this over the grid: at N2, REM raises Hellinger fidelity in 6/6 (n, L) cells (mean gain 0.0160) and raises the success-probability ratio toward 1.</w:t>
       </w:r>
     </w:p>
     <w:p>
@@ -15890,7 +15906,7 @@
           <w:sz w:val="18"/>
           <w:szCs w:val="18"/>
         </w:rPr>
-        <w:t xml:space="preserve">Figure 12: Measurement-count distributions for n = 4, L = 4 at N2: exact, unmitigated and REM-corrected.</w:t>
+        <w:t xml:space="preserve">Figure 12: Output distribution for n = 4, L = 4, N2, seed 0: exact, unmitigated, full REM and tensored REM.</w:t>
       </w:r>
     </w:p>
     <w:p>
@@ -15947,7 +15963,7 @@
           <w:sz w:val="18"/>
           <w:szCs w:val="18"/>
         </w:rPr>
-        <w:t xml:space="preserve">Figure 13: Hellinger infidelity (1 − F) before and after REM, full and tensored.</w:t>
+        <w:t xml:space="preserve">Figure 13: Hellinger infidelity (1 − F) by noise level (N0–N2): no mitigation vs. full and tensored REM, one panel per (n, L).</w:t>
       </w:r>
     </w:p>
     <w:p>
@@ -16004,7 +16020,7 @@
           <w:sz w:val="18"/>
           <w:szCs w:val="18"/>
         </w:rPr>
-        <w:t xml:space="preserve">Figure 14: Success-probability ratio P_succ_hat / P_succ_exact by method and noise level.</w:t>
+        <w:t xml:space="preserve">Figure 14: Success-probability ratio P_succ_hat / P_succ_exact (1 = exact) by noise level (N0–N2) and method, one panel per (n, L).</w:t>
       </w:r>
     </w:p>
     <w:p>
@@ -16017,7 +16033,7 @@
           <w:sz w:val="22"/>
           <w:szCs w:val="22"/>
         </w:rPr>
-        <w:t xml:space="preserve">Figure 15 shows the ZNE extrapolation for one circuit: the raw points (ZNE) extrapolate to a value still short of the exact parity because readout error is not folded, while the REM-corrected points (ZNE+REM) extrapolate much closer. Figure 16 separates bias from spread at N2: ZNE removes bias but widens the spread.</w:t>
+        <w:t xml:space="preserve">Figure 15 shows the ZNE extrapolation for one circuit (n = 4, L = 4, N2, seed 0; exact parity 0.408, unmitigated 0.197). Extrapolating the raw points (ZNE) gives 0.256, still short of the exact value, partly because readout error is not folded; extrapolating the REM-corrected points (ZNE+REM) gives 0.325, closer but not exact. Figure 16 shows the bias–spread trade-off at N2, pooled over all circuits: unmitigated estimates are shrunk toward 0 (median oriented error −0.183); REM, tensored REM and ZNE each remove about half of that shrinkage (medians −0.093, −0.091, −0.098); only ZNE+REM is centred near zero (+0.015), and the ZNE-based methods have the widest spread (SD 0.072 and 0.080, against 0.059 with no mitigation).</w:t>
       </w:r>
     </w:p>
     <w:p>
@@ -16131,7 +16147,7 @@
           <w:sz w:val="18"/>
           <w:szCs w:val="18"/>
         </w:rPr>
-        <w:t xml:space="preserve">Figure 16: Bias and spread of each method at N2.</w:t>
+        <w:t xml:space="preserve">Figure 16: Bias and spread at N2, pooled over n, L and seeds: signed error (left) and error oriented so that negative means shrunk toward 0 (right).</w:t>
       </w:r>
     </w:p>
     <w:p>
@@ -16144,7 +16160,7 @@
           <w:sz w:val="22"/>
           <w:szCs w:val="22"/>
         </w:rPr>
-        <w:t xml:space="preserve">For Track B, Figure 17 shows that VQC accuracy barely moves with noise and stays close to Logistic Regression and SVM, while Figures 18 and 19 show what accuracy hides: the mean expectation error grows with noise and the outputs shrink toward 0 without changing sign, and mitigation pulls them back. Figure 20 shows the noiseless training curves (convergence of the MSE loss).</w:t>
+        <w:t xml:space="preserve">For Track B, Figure 17 shows that VQC accuracy barely moves with noise (N0–N3) and stays close to Logistic Regression and SVM. Figures 18 and 19 show what accuracy hides: the mean expectation error grows with noise, and for n = 4, L = 2 the outputs shrink toward 0 at N2 and N3, mostly without changing sign, while ZNE+REM pulls them back toward the diagonal. Figure 20 shows the noiseless training curves.</w:t>
       </w:r>
     </w:p>
     <w:p>
@@ -16201,7 +16217,7 @@
           <w:sz w:val="18"/>
           <w:szCs w:val="18"/>
         </w:rPr>
-        <w:t xml:space="preserve">Figure 17: VQC test accuracy vs. noise level by method; Logistic Regression and SVM as horizontal lines.</w:t>
+        <w:t xml:space="preserve">Figure 17: VQC test accuracy vs. noise level (N0–N3) by method, one panel per (n, L) (mean ± SD over 5 seeds); Logistic Regression and SVM as horizontal lines.</w:t>
       </w:r>
     </w:p>
     <w:p>
@@ -16258,7 +16274,7 @@
           <w:sz w:val="18"/>
           <w:szCs w:val="18"/>
         </w:rPr>
-        <w:t xml:space="preserve">Figure 18: Mean |E_hat − E_exact| over the VQC test set vs. noise level.</w:t>
+        <w:t xml:space="preserve">Figure 18: Mean |E_hat − E_exact| over the VQC test set vs. noise level, for n = 2 and n = 4 (mean over L).</w:t>
       </w:r>
     </w:p>
     <w:p>
@@ -16315,7 +16331,7 @@
           <w:sz w:val="18"/>
           <w:szCs w:val="18"/>
         </w:rPr>
-        <w:t xml:space="preserve">Figure 19: E_hat against E_exact on the test set: noise shrinks margins toward 0; points near the diagonal are undistorted.</w:t>
+        <w:t xml:space="preserve">Figure 19: E_hat against E_exact for n = 4, L = 2 (100 test predictions pooled over 5 seeds) at N2 and N3, without mitigation and with ZNE+REM; the diagonal is E_hat = E_exact.</w:t>
       </w:r>
     </w:p>
     <w:p>
@@ -16372,7 +16388,7 @@
           <w:sz w:val="18"/>
           <w:szCs w:val="18"/>
         </w:rPr>
-        <w:t xml:space="preserve">Figure 20: VQC training curves (noiseless COBYLA, MSE loss vs. iteration).</w:t>
+        <w:t xml:space="preserve">Figure 20: VQC training curves (noiseless): MSE loss against COBYLA objective evaluations, per (n, L) and seed.</w:t>
       </w:r>
     </w:p>
     <w:p>
@@ -16385,7 +16401,7 @@
           <w:sz w:val="22"/>
           <w:szCs w:val="22"/>
         </w:rPr>
-        <w:t xml:space="preserve">Figure 21 compares tensored and full REM condition by condition (points on the diagonal agree), and Figure 22 compares the standard deviation of the Richardson estimate under uniform and variance-optimal shot allocation at the same total budget.</w:t>
+        <w:t xml:space="preserve">Figure 21 compares tensored and full REM condition by condition (points on the diagonal agree). Figure 22 compares the empirical standard deviation of the Richardson estimate under uniform and variance-optimal shot allocation at the same 3072-shot budget, averaged over the 5 circuit instances of each condition: the optimal split is lower in 12 of 12 conditions.</w:t>
       </w:r>
     </w:p>
     <w:p>
@@ -16442,7 +16458,7 @@
           <w:sz w:val="18"/>
           <w:szCs w:val="18"/>
         </w:rPr>
-        <w:t xml:space="preserve">Figure 21: Full vs. tensored REM error per condition.</w:t>
+        <w:t xml:space="preserve">Figure 21: Full vs. tensored REM absolute error for every condition at N1–N3 (marker: noise level; colour: qubit count).</w:t>
       </w:r>
     </w:p>
     <w:p>
@@ -16499,7 +16515,7 @@
           <w:sz w:val="18"/>
           <w:szCs w:val="18"/>
         </w:rPr>
-        <w:t xml:space="preserve">Figure 22: Empirical std of the Richardson estimate: uniform vs. optimal shot allocation at 3072 total shots.</w:t>
+        <w:t xml:space="preserve">Figure 22: Empirical std of the Richardson estimate, uniform vs. optimal allocation at 3072 total shots (mean ± SD over the 5 circuit instances of each condition).</w:t>
       </w:r>
     </w:p>
     <w:p>
@@ -17871,7 +17887,7 @@
           <w:sz w:val="22"/>
           <w:szCs w:val="22"/>
         </w:rPr>
-        <w:t xml:space="preserve"> ZNE's standard deviation is 2.38×, 2.42×, 2.70× and 2.07× the baseline's at N0–N3, against 2.28× predicted by the Richardson weights. At N0 there is no bias to remove, and ZNE was worse than no mitigation in 26/30 runs (Figure 16).</w:t>
+        <w:t xml:space="preserve"> ZNE's standard deviation is 2.38×, 2.42×, 2.70× and 2.07× the baseline's at N0–N3, against 2.28× predicted by the Richardson weights. Each ratio compares two standard deviations estimated from 30 runs, which carries roughly ±19% relative uncertainty, so these values are consistent with theory. At N0 there is no bias to remove, and ZNE was worse than no mitigation in 26/30 runs (Figure 9).</w:t>
       </w:r>
     </w:p>
     <w:p>
@@ -17917,7 +17933,7 @@
           <w:sz w:val="22"/>
           <w:szCs w:val="22"/>
         </w:rPr>
-        <w:t xml:space="preserve"> The exact VQC reaches 0.920 mean accuracy, comparable to Logistic Regression (0.920 / 0.930) and SVM (0.920 / 0.910) on identical inputs (Table 3). At N3, unmitigated margin retention falls to 0.411 and mean expectation error rises to 0.301, yet accuracy only drops from 0.920 to 0.900; ZNE+REM restores margin retention to 0.847 with almost no change in accuracy (0.903). Accuracy depends only on the sign of the output and moves in 5% steps on 20 test samples, so it is too coarse to show what the continuous metrics show.</w:t>
+        <w:t xml:space="preserve"> The exact VQC reaches 0.920 mean accuracy, comparable to Logistic Regression (0.920 / 0.930 for n = 2 / 4) and SVM (0.920 / 0.910) on identical inputs (Tables 3 and 4). At N3, unmitigated margin retention falls to 0.411 and mean expectation error rises to 0.301, yet accuracy only drops from 0.920 to 0.900; ZNE+REM restores margin retention to 0.847 with almost no change in accuracy (0.903). Accuracy depends only on the sign of the output and moves in 5% steps on 20 test samples, so it is too coarse to show what the continuous metrics show.</w:t>
       </w:r>
     </w:p>
     <w:p>
@@ -18210,7 +18226,7 @@
                 <w:sz w:val="17"/>
                 <w:szCs w:val="17"/>
               </w:rPr>
-              <w:t xml:space="preserve">Supported</w:t>
+              <w:t xml:space="preserve">Partly supported</w:t>
             </w:r>
           </w:p>
         </w:tc>
@@ -18240,7 +18256,7 @@
                 <w:sz w:val="17"/>
                 <w:szCs w:val="17"/>
               </w:rPr>
-              <w:t xml:space="preserve">0.021 → 0.062 → 0.181 → 0.310 from N0 to N3; growth with n and L in Figure 10.</w:t>
+              <w:t xml:space="preserve">Rises with noise level in all 6 (n, L) cells (pooled 0.021 → 0.062 → 0.181 → 0.310). Averaged over the other parameter, error is lowest at n = 2 and higher at L = 4 than L = 2 at N1–N3, but not in every cell: at N2, n = 4, L = 2 has 0.199 vs 0.183 for n = 6, L = 2, because each cell uses different circuit instances (Figures 9 and 10).</w:t>
             </w:r>
           </w:p>
         </w:tc>
@@ -18752,7 +18768,7 @@
                 <w:sz w:val="17"/>
                 <w:szCs w:val="17"/>
               </w:rPr>
-              <w:t xml:space="preserve">Std ratio 2.07×–2.70× (theory 2.28×); worse than no mitigation at N0 in 26/30 runs.</w:t>
+              <w:t xml:space="preserve">Std ratio 2.07×–2.70× (theory 2.28×, within the ±19% sampling uncertainty of 30 runs); worse than no mitigation at N0 in 26/30 runs.</w:t>
             </w:r>
           </w:p>
         </w:tc>
@@ -19514,7 +19530,7 @@
           <w:sz w:val="18"/>
           <w:szCs w:val="18"/>
         </w:rPr>
-        <w:t xml:space="preserve">Figure 24: Cost (total shots) against benefit (error reduction factor) for each method.</w:t>
+        <w:t xml:space="preserve">Figure 24: Cost (total shots per estimate) against benefit (mean error reduction factor), both on log scales, at N1 and N2; dashed line: no improvement.</w:t>
       </w:r>
     </w:p>
     <w:p>
@@ -19604,7 +19620,7 @@
           <w:sz w:val="22"/>
           <w:szCs w:val="22"/>
         </w:rPr>
-        <w:t xml:space="preserve"> It amplifies variance (measured 2.07×–2.70×, above the 2.28× theory at N2), its extrapolation model can mismatch the true decay (the exponential fit failed in 10/120 ZNE conditions), it never removes readout error, and its deepest folded circuit (95 deep, 5× the base) could exceed coherence times on hardware.</w:t>
+        <w:t xml:space="preserve"> It amplifies variance (measured 2.07×–2.70×, consistent within sampling uncertainty with the 2.28× theory), its extrapolation model can mismatch the true decay (the exponential fit failed in 10/120 ZNE conditions), it never removes readout error, and its deepest folded circuit (95 deep, 5× the base) could exceed coherence times on hardware.</w:t>
       </w:r>
     </w:p>
     <w:p>
@@ -20010,7 +20026,7 @@
                 <w:sz w:val="20"/>
                 <w:szCs w:val="20"/>
               </w:rPr>
-              <w:t xml:space="preserve">ZNE+REM at N2 on n = 4, L = 4: median error cut 80% (error 0.209 ± 0.039 → 0.051 ± 0.021). Gate noise dominates the bias there and the combination removes both the gate and the readout parts. Where cost matters more, tensored REM gives most of REM's benefit for 3 circuits at any n.</w:t>
+              <w:t xml:space="preserve">Largest median error cut overall: ZNE+REM at N3, n = 4, L = 2 (87%), at the stress level. At the headline levels: REM at N1, n = 6, L = 2 (82%), error 0.051 ± 0.021 → 0.013 ± 0.010; and ZNE+REM at N2, n = 4, L = 4 (80%), error 0.209 ± 0.039 → 0.051 ± 0.021. Why: REM alone wins where readout dominates the bias (readout share 65% in that N1 cell); ZNE+REM wins where gate noise dominates (readout share 29% in that N2 cell). Where cost matters, tensored REM gives the same benefit as full REM (within 0.0063) for 3 circuits at any n.</w:t>
             </w:r>
           </w:p>
         </w:tc>
@@ -20146,7 +20162,7 @@
                 <w:sz w:val="20"/>
                 <w:szCs w:val="20"/>
               </w:rPr>
-              <w:t xml:space="preserve">ZNE alone was not significant at N1 and was worse than no mitigation at N0 in 26/30 runs. Measured ZNE variance amplification (2.07–2.70×) exceeded the 2.28× theory at N2. No runaway ZNE failure at N3 (Richardson out of range 0/120), although exponential fits failed more often. Classification accuracy was insensitive to both noise and mitigation.</w:t>
+              <w:t xml:space="preserve">ZNE alone was not significant at N1 and was worse than no mitigation at N0 in 26/30 runs. Unmitigated error grows with noise in every cell but not monotonically with n and L in every cell (H1 only partly supported). No runaway ZNE failure at N3 (Richardson out of range 0/120), although exponential fits failed more often. Classification accuracy was insensitive to both noise and mitigation.</w:t>
             </w:r>
           </w:p>
         </w:tc>

</xml_diff>

<commit_message>
Add the final submission PDF with cover page
report/Group20_Quantum_Report.pdf is the cover page followed by the filled
course template: contribution split, guide, course details, declaration,
and real terminal and code screenshots in Section 4.4. The dashboard build
publishes the PDF next to the Word source at the link the report cites.
</commit_message>
<xml_diff>
--- a/dashboard/quantum-error-mitigation-bench/Group20_Report.docx
+++ b/dashboard/quantum-error-mitigation-bench/Group20_Report.docx
@@ -2,6 +2,51 @@
 <file path=word/document.xml><?xml version="1.0" encoding="utf-8"?>
 <w:document xmlns:wpc="http://schemas.microsoft.com/office/word/2010/wordprocessingCanvas" xmlns:mc="http://schemas.openxmlformats.org/markup-compatibility/2006" xmlns:o="urn:schemas-microsoft-com:office:office" xmlns:r="http://schemas.openxmlformats.org/officeDocument/2006/relationships" xmlns:m="http://schemas.openxmlformats.org/officeDocument/2006/math" xmlns:v="urn:schemas-microsoft-com:vml" xmlns:wp14="http://schemas.microsoft.com/office/word/2010/wordprocessingDrawing" xmlns:wp="http://schemas.openxmlformats.org/drawingml/2006/wordprocessingDrawing" xmlns:w10="urn:schemas-microsoft-com:office:word" xmlns:w="http://schemas.openxmlformats.org/wordprocessingml/2006/main" xmlns:w14="http://schemas.microsoft.com/office/word/2010/wordml" xmlns:w15="http://schemas.microsoft.com/office/word/2012/wordml" xmlns:wpg="http://schemas.microsoft.com/office/word/2010/wordprocessingGroup" xmlns:wpi="http://schemas.microsoft.com/office/word/2010/wordprocessingInk" xmlns:wne="http://schemas.microsoft.com/office/word/2006/wordml" xmlns:wps="http://schemas.microsoft.com/office/word/2010/wordprocessingShape" xmlns:cx="http://schemas.microsoft.com/office/drawing/2014/chartex" xmlns:cx1="http://schemas.microsoft.com/office/drawing/2015/9/8/chartex" xmlns:cx2="http://schemas.microsoft.com/office/drawing/2015/10/21/chartex" xmlns:cx3="http://schemas.microsoft.com/office/drawing/2016/5/9/chartex" xmlns:cx4="http://schemas.microsoft.com/office/drawing/2016/5/10/chartex" xmlns:cx5="http://schemas.microsoft.com/office/drawing/2016/5/11/chartex" xmlns:cx6="http://schemas.microsoft.com/office/drawing/2016/5/12/chartex" xmlns:cx7="http://schemas.microsoft.com/office/drawing/2016/5/13/chartex" xmlns:cx8="http://schemas.microsoft.com/office/drawing/2016/5/14/chartex" xmlns:aink="http://schemas.microsoft.com/office/drawing/2016/ink" xmlns:am3d="http://schemas.microsoft.com/office/drawing/2017/model3d" xmlns:w16cex="http://schemas.microsoft.com/office/word/2018/wordml/cex" xmlns:w16cid="http://schemas.microsoft.com/office/word/2016/wordml/cid" xmlns:w16="http://schemas.microsoft.com/office/word/2018/wordml" xmlns:w16sdtdh="http://schemas.microsoft.com/office/word/2020/wordml/sdtdatahash" xmlns:w16se="http://schemas.microsoft.com/office/word/2015/wordml/symex" mc:Ignorable="w14 w15 wp14">
   <w:body>
+    <w:p>
+      <w:pPr>
+        <w:spacing w:before="0" w:after="0" w:line="240" w:lineRule="auto"/>
+        <w:jc w:val="center"/>
+        <w:sectPr>
+          <w:pgSz w:w="11906" w:h="16838" w:orient="portrait"/>
+          <w:pgMar w:top="0" w:right="0" w:bottom="0" w:left="0" w:header="0" w:footer="0" w:gutter="0"/>
+          <w:docGrid w:linePitch="360"/>
+        </w:sectPr>
+      </w:pPr>
+      <w:r>
+        <w:drawing>
+          <wp:inline xmlns:a="http://schemas.openxmlformats.org/drawingml/2006/main" xmlns:pic="http://schemas.openxmlformats.org/drawingml/2006/picture">
+            <wp:extent cx="7315200" cy="10351030"/>
+            <wp:docPr id="5" name="Picture 5"/>
+            <wp:cNvGraphicFramePr>
+              <a:graphicFrameLocks noChangeAspect="1"/>
+            </wp:cNvGraphicFramePr>
+            <a:graphic>
+              <a:graphicData uri="http://schemas.openxmlformats.org/drawingml/2006/picture">
+                <pic:pic>
+                  <pic:nvPicPr>
+                    <pic:cNvPr id="0" name="cover_200.png"/>
+                    <pic:cNvPicPr/>
+                  </pic:nvPicPr>
+                  <pic:blipFill>
+                    <a:blip r:embed="rId37"/>
+                    <a:stretch>
+                      <a:fillRect/>
+                    </a:stretch>
+                  </pic:blipFill>
+                  <pic:spPr>
+                    <a:xfrm>
+                      <a:off x="0" y="0"/>
+                      <a:ext cx="7315200" cy="10351030"/>
+                    </a:xfrm>
+                    <a:prstGeom prst="rect"/>
+                  </pic:spPr>
+                </pic:pic>
+              </a:graphicData>
+            </a:graphic>
+          </wp:inline>
+        </w:drawing>
+      </w:r>
+    </w:p>
     <w:p>
       <w:pPr>
         <w:spacing w:after="60" w:before="600"/>
@@ -379,13 +424,10 @@
             <w:r>
               <w:rPr>
                 <w:rFonts w:ascii="Calibri" w:cs="Calibri" w:eastAsia="Calibri" w:hAnsi="Calibri"/>
-                <w:b/>
-                <w:bCs/>
                 <w:sz w:val="20"/>
                 <w:szCs w:val="20"/>
-                <w:highlight w:val="yellow"/>
-              </w:rPr>
-              <w:t xml:space="preserve">Team to fill</w:t>
+              </w:rPr>
+              <w:t xml:space="preserve">Project lead (about 70% of the work): Track A testbed and mitigation methods, VQC, all experiment runs, analysis and report writing</w:t>
             </w:r>
           </w:p>
         </w:tc>
@@ -507,13 +549,10 @@
             <w:r>
               <w:rPr>
                 <w:rFonts w:ascii="Calibri" w:cs="Calibri" w:eastAsia="Calibri" w:hAnsi="Calibri"/>
-                <w:b/>
-                <w:bCs/>
                 <w:sz w:val="20"/>
                 <w:szCs w:val="20"/>
-                <w:highlight w:val="yellow"/>
-              </w:rPr>
-              <w:t xml:space="preserve">Team to fill</w:t>
+              </w:rPr>
+              <w:t xml:space="preserve">Team member (about 30% of the work): Iris preprocessing and LR/SVM baselines, literature review, testing and report review</w:t>
             </w:r>
           </w:p>
         </w:tc>
@@ -611,18 +650,7 @@
                 <w:sz w:val="20"/>
                 <w:szCs w:val="20"/>
               </w:rPr>
-              <w:t xml:space="preserve">Quantum Computing; section: </w:t>
-            </w:r>
-            <w:r>
-              <w:rPr>
-                <w:rFonts w:ascii="Calibri" w:cs="Calibri" w:eastAsia="Calibri" w:hAnsi="Calibri"/>
-                <w:b/>
-                <w:bCs/>
-                <w:sz w:val="20"/>
-                <w:szCs w:val="20"/>
-                <w:highlight w:val="yellow"/>
-              </w:rPr>
-              <w:t xml:space="preserve">Team to fill</w:t>
+              <w:t xml:space="preserve">Quantum Computing (23CYE732), VII Semester, Department of Computer Science and Engineering (Cyber Security), M. S. Ramaiah Institute of Technology, Academic Year 2026–2027</w:t>
             </w:r>
           </w:p>
         </w:tc>
@@ -687,13 +715,10 @@
             <w:r>
               <w:rPr>
                 <w:rFonts w:ascii="Calibri" w:cs="Calibri" w:eastAsia="Calibri" w:hAnsi="Calibri"/>
-                <w:b/>
-                <w:bCs/>
                 <w:sz w:val="20"/>
                 <w:szCs w:val="20"/>
-                <w:highlight w:val="yellow"/>
-              </w:rPr>
-              <w:t xml:space="preserve">Team to fill</w:t>
+              </w:rPr>
+              <w:t xml:space="preserve">Dr. Sajni G, Professor</w:t>
             </w:r>
           </w:p>
         </w:tc>
@@ -758,13 +783,10 @@
             <w:r>
               <w:rPr>
                 <w:rFonts w:ascii="Calibri" w:cs="Calibri" w:eastAsia="Calibri" w:hAnsi="Calibri"/>
-                <w:b/>
-                <w:bCs/>
                 <w:sz w:val="20"/>
                 <w:szCs w:val="20"/>
-                <w:highlight w:val="yellow"/>
-              </w:rPr>
-              <w:t xml:space="preserve">Team to fill</w:t>
+              </w:rPr>
+              <w:t xml:space="preserve">11 October 2026</w:t>
             </w:r>
           </w:p>
         </w:tc>
@@ -829,13 +851,10 @@
             <w:r>
               <w:rPr>
                 <w:rFonts w:ascii="Calibri" w:cs="Calibri" w:eastAsia="Calibri" w:hAnsi="Calibri"/>
-                <w:b/>
-                <w:bCs/>
                 <w:sz w:val="20"/>
                 <w:szCs w:val="20"/>
-                <w:highlight w:val="yellow"/>
-              </w:rPr>
-              <w:t xml:space="preserve">Team to fill: Google Drive link to the PDF</w:t>
+              </w:rPr>
+              <w:t xml:space="preserve">https://quantum-error-mitigation-bench.vercel.app/Group20_Quantum_Report.pdf</w:t>
             </w:r>
           </w:p>
         </w:tc>
@@ -8174,7 +8193,7 @@
           <w:sz w:val="22"/>
           <w:szCs w:val="22"/>
         </w:rPr>
-        <w:t xml:space="preserve">Environment and version print-out</w:t>
+        <w:t xml:space="preserve">Environment, versions and tests.</w:t>
       </w:r>
       <w:r>
         <w:rPr>
@@ -8182,102 +8201,82 @@
           <w:sz w:val="22"/>
           <w:szCs w:val="22"/>
         </w:rPr>
-        <w:t xml:space="preserve"> (run in the project environment):</w:t>
+        <w:t xml:space="preserve"> A terminal in the project's virtual environment printing the Python and library versions, then running the full test suite.</w:t>
       </w:r>
     </w:p>
     <w:p>
       <w:pPr>
         <w:keepNext/>
-        <w:keepLines/>
-        <w:shd w:val="clear" w:color="auto" w:fill="F2F2F2"/>
-        <w:spacing w:after="0" w:before="0" w:line="240" w:lineRule="auto"/>
-      </w:pPr>
+        <w:spacing w:after="40" w:before="0"/>
+        <w:jc w:val="center"/>
+      </w:pPr>
+      <w:r>
+        <w:drawing>
+          <wp:inline xmlns:a="http://schemas.openxmlformats.org/drawingml/2006/main" xmlns:pic="http://schemas.openxmlformats.org/drawingml/2006/picture">
+            <wp:extent cx="6035040" cy="1844188"/>
+            <wp:docPr id="2" name="Picture 2"/>
+            <wp:cNvGraphicFramePr>
+              <a:graphicFrameLocks noChangeAspect="1"/>
+            </wp:cNvGraphicFramePr>
+            <a:graphic>
+              <a:graphicData uri="http://schemas.openxmlformats.org/drawingml/2006/picture">
+                <pic:pic>
+                  <pic:nvPicPr>
+                    <pic:cNvPr id="0" name="env_tests_crop.png"/>
+                    <pic:cNvPicPr/>
+                  </pic:nvPicPr>
+                  <pic:blipFill>
+                    <a:blip r:embed="rId17"/>
+                    <a:stretch>
+                      <a:fillRect/>
+                    </a:stretch>
+                  </pic:blipFill>
+                  <pic:spPr>
+                    <a:xfrm>
+                      <a:off x="0" y="0"/>
+                      <a:ext cx="6035040" cy="1844188"/>
+                    </a:xfrm>
+                    <a:prstGeom prst="rect"/>
+                  </pic:spPr>
+                </pic:pic>
+              </a:graphicData>
+            </a:graphic>
+          </wp:inline>
+        </w:drawing>
+      </w:r>
+    </w:p>
+    <w:p>
+      <w:pPr>
+        <w:spacing w:after="160" w:before="0"/>
+        <w:jc w:val="center"/>
+      </w:pPr>
+      <w:r>
+        <w:rPr>
+          <w:rFonts w:ascii="Calibri" w:cs="Calibri" w:eastAsia="Calibri" w:hAnsi="Calibri"/>
+          <w:i/>
+          <w:iCs/>
+          <w:sz w:val="18"/>
+          <w:szCs w:val="18"/>
+        </w:rPr>
+        <w:t xml:space="preserve">Figure 8: Terminal screenshot: Python 3.11.15, the library versions, and </w:t>
+      </w:r>
       <w:r>
         <w:rPr>
           <w:rFonts w:ascii="Consolas" w:cs="Consolas" w:eastAsia="Consolas" w:hAnsi="Consolas"/>
           <w:sz w:val="16"/>
           <w:szCs w:val="16"/>
         </w:rPr>
-        <w:t xml:space="preserve">Python       3.11.15 | Windows-10-10.0.26200-SP0</w:t>
-      </w:r>
-    </w:p>
-    <w:p>
-      <w:pPr>
-        <w:keepNext/>
-        <w:keepLines/>
-        <w:shd w:val="clear" w:color="auto" w:fill="F2F2F2"/>
-        <w:spacing w:after="0" w:before="0" w:line="240" w:lineRule="auto"/>
-      </w:pPr>
-      <w:r>
-        <w:rPr>
-          <w:rFonts w:ascii="Consolas" w:cs="Consolas" w:eastAsia="Consolas" w:hAnsi="Consolas"/>
-          <w:sz w:val="16"/>
-          <w:szCs w:val="16"/>
-        </w:rPr>
-        <w:t xml:space="preserve">qiskit       2.5.2</w:t>
-      </w:r>
-    </w:p>
-    <w:p>
-      <w:pPr>
-        <w:keepNext/>
-        <w:keepLines/>
-        <w:shd w:val="clear" w:color="auto" w:fill="F2F2F2"/>
-        <w:spacing w:after="0" w:before="0" w:line="240" w:lineRule="auto"/>
-      </w:pPr>
-      <w:r>
-        <w:rPr>
-          <w:rFonts w:ascii="Consolas" w:cs="Consolas" w:eastAsia="Consolas" w:hAnsi="Consolas"/>
-          <w:sz w:val="16"/>
-          <w:szCs w:val="16"/>
-        </w:rPr>
-        <w:t xml:space="preserve">qiskit-aer   0.17.2</w:t>
-      </w:r>
-    </w:p>
-    <w:p>
-      <w:pPr>
-        <w:keepNext/>
-        <w:keepLines/>
-        <w:shd w:val="clear" w:color="auto" w:fill="F2F2F2"/>
-        <w:spacing w:after="0" w:before="0" w:line="240" w:lineRule="auto"/>
-      </w:pPr>
-      <w:r>
-        <w:rPr>
-          <w:rFonts w:ascii="Consolas" w:cs="Consolas" w:eastAsia="Consolas" w:hAnsi="Consolas"/>
-          <w:sz w:val="16"/>
-          <w:szCs w:val="16"/>
-        </w:rPr>
-        <w:t xml:space="preserve">numpy        2.4.6 | scipy 1.17.1 | pandas 3.0.6</w:t>
-      </w:r>
-    </w:p>
-    <w:p>
-      <w:pPr>
-        <w:keepNext/>
-        <w:keepLines/>
-        <w:shd w:val="clear" w:color="auto" w:fill="F2F2F2"/>
-        <w:spacing w:after="0" w:before="0" w:line="240" w:lineRule="auto"/>
-      </w:pPr>
-      <w:r>
-        <w:rPr>
-          <w:rFonts w:ascii="Consolas" w:cs="Consolas" w:eastAsia="Consolas" w:hAnsi="Consolas"/>
-          <w:sz w:val="16"/>
-          <w:szCs w:val="16"/>
-        </w:rPr>
-        <w:t xml:space="preserve">matplotlib   3.11.2 | scikit-learn 1.9.1</w:t>
-      </w:r>
-    </w:p>
-    <w:p>
-      <w:pPr>
-        <w:keepLines/>
-        <w:shd w:val="clear" w:color="auto" w:fill="F2F2F2"/>
-        <w:spacing w:after="120" w:before="0" w:line="240" w:lineRule="auto"/>
-      </w:pPr>
-      <w:r>
-        <w:rPr>
-          <w:rFonts w:ascii="Consolas" w:cs="Consolas" w:eastAsia="Consolas" w:hAnsi="Consolas"/>
-          <w:sz w:val="16"/>
-          <w:szCs w:val="16"/>
-        </w:rPr>
-        <w:t xml:space="preserve">simulator    aer_simulator_density_matrix (method=density_matrix)</w:t>
+        <w:t xml:space="preserve">pytest -q</w:t>
+      </w:r>
+      <w:r>
+        <w:rPr>
+          <w:rFonts w:ascii="Calibri" w:cs="Calibri" w:eastAsia="Calibri" w:hAnsi="Calibri"/>
+          <w:i/>
+          <w:iCs/>
+          <w:sz w:val="18"/>
+          <w:szCs w:val="18"/>
+        </w:rPr>
+        <w:t xml:space="preserve"> with all 186 tests passing.</w:t>
       </w:r>
     </w:p>
     <w:p>
@@ -8293,7 +8292,7 @@
           <w:sz w:val="22"/>
           <w:szCs w:val="22"/>
         </w:rPr>
-        <w:t xml:space="preserve">Successful runs</w:t>
+        <w:t xml:space="preserve">A successful run.</w:t>
       </w:r>
       <w:r>
         <w:rPr>
@@ -8301,102 +8300,64 @@
           <w:sz w:val="22"/>
           <w:szCs w:val="22"/>
         </w:rPr>
-        <w:t xml:space="preserve"> (final lines of the saved logs in results/logs/):</w:t>
+        <w:t xml:space="preserve"> The full Track A sweep (120 conditions, 600 result rows) rerun from scratch into a separate folder and compared with the committed results: the rerun is identical apart from the two wall-clock timing columns, which shows that the experiment is reproducible.</w:t>
       </w:r>
     </w:p>
     <w:p>
       <w:pPr>
         <w:keepNext/>
-        <w:keepLines/>
-        <w:shd w:val="clear" w:color="auto" w:fill="F2F2F2"/>
-        <w:spacing w:after="0" w:before="0" w:line="240" w:lineRule="auto"/>
-      </w:pPr>
-      <w:r>
-        <w:rPr>
-          <w:rFonts w:ascii="Consolas" w:cs="Consolas" w:eastAsia="Consolas" w:hAnsi="Consolas"/>
-          <w:sz w:val="16"/>
-          <w:szCs w:val="16"/>
-        </w:rPr>
-        <w:t xml:space="preserve">2026-10-07 05:26:51,445 INFO qem.experiment: sweep finished: 600 rows in 17.1s</w:t>
-      </w:r>
-    </w:p>
-    <w:p>
-      <w:pPr>
-        <w:keepNext/>
-        <w:keepLines/>
-        <w:shd w:val="clear" w:color="auto" w:fill="F2F2F2"/>
-        <w:spacing w:after="0" w:before="0" w:line="240" w:lineRule="auto"/>
-      </w:pPr>
-      <w:r>
-        <w:rPr>
-          <w:rFonts w:ascii="Consolas" w:cs="Consolas" w:eastAsia="Consolas" w:hAnsi="Consolas"/>
-          <w:sz w:val="16"/>
-          <w:szCs w:val="16"/>
-        </w:rPr>
-        <w:t xml:space="preserve">2026-10-07 05:26:51,447 INFO qem.experiment: spot-check: mean abs_error of none at moderate (0.1809) &gt; low (0.0622)</w:t>
-      </w:r>
-    </w:p>
-    <w:p>
-      <w:pPr>
-        <w:keepNext/>
-        <w:keepLines/>
-        <w:shd w:val="clear" w:color="auto" w:fill="F2F2F2"/>
-        <w:spacing w:after="0" w:before="0" w:line="240" w:lineRule="auto"/>
-      </w:pPr>
-      <w:r>
-        <w:rPr>
-          <w:rFonts w:ascii="Consolas" w:cs="Consolas" w:eastAsia="Consolas" w:hAnsi="Consolas"/>
-          <w:sz w:val="16"/>
-          <w:szCs w:val="16"/>
-        </w:rPr>
-        <w:t xml:space="preserve">2026-10-07 05:35:14,342 INFO qem.qml.runner: track B sweep finished: 360 rows in 494.1s</w:t>
-      </w:r>
-    </w:p>
-    <w:p>
-      <w:pPr>
-        <w:keepNext/>
-        <w:keepLines/>
-        <w:shd w:val="clear" w:color="auto" w:fill="F2F2F2"/>
-        <w:spacing w:after="0" w:before="0" w:line="240" w:lineRule="auto"/>
-      </w:pPr>
-      <w:r>
-        <w:rPr>
-          <w:rFonts w:ascii="Consolas" w:cs="Consolas" w:eastAsia="Consolas" w:hAnsi="Consolas"/>
-          <w:sz w:val="16"/>
-          <w:szCs w:val="16"/>
-        </w:rPr>
-        <w:t xml:space="preserve">2026-10-07 05:37:18,275 INFO qem.improvement: improvement sweep finished: 120 rows in 115.1s</w:t>
-      </w:r>
-    </w:p>
-    <w:p>
-      <w:pPr>
-        <w:keepNext/>
-        <w:keepLines/>
-        <w:shd w:val="clear" w:color="auto" w:fill="F2F2F2"/>
-        <w:spacing w:after="0" w:before="0" w:line="240" w:lineRule="auto"/>
-      </w:pPr>
-      <w:r>
-        <w:rPr>
-          <w:rFonts w:ascii="Consolas" w:cs="Consolas" w:eastAsia="Consolas" w:hAnsi="Consolas"/>
-          <w:sz w:val="16"/>
-          <w:szCs w:val="16"/>
-        </w:rPr>
-        <w:t xml:space="preserve">2026-10-07 05:37:18,275 INFO qem.improvement: spot-check: mean empirical std ratio (optimal/uniform) = 0.874 (theory ~0.885)</w:t>
-      </w:r>
-    </w:p>
-    <w:p>
-      <w:pPr>
-        <w:keepLines/>
-        <w:shd w:val="clear" w:color="auto" w:fill="F2F2F2"/>
-        <w:spacing w:after="120" w:before="0" w:line="240" w:lineRule="auto"/>
-      </w:pPr>
-      <w:r>
-        <w:rPr>
-          <w:rFonts w:ascii="Consolas" w:cs="Consolas" w:eastAsia="Consolas" w:hAnsi="Consolas"/>
-          <w:sz w:val="16"/>
-          <w:szCs w:val="16"/>
-        </w:rPr>
-        <w:t xml:space="preserve">pytest -q: 186 passed in 40.06s</w:t>
+        <w:spacing w:after="40" w:before="0"/>
+        <w:jc w:val="center"/>
+      </w:pPr>
+      <w:r>
+        <w:drawing>
+          <wp:inline xmlns:a="http://schemas.openxmlformats.org/drawingml/2006/main" xmlns:pic="http://schemas.openxmlformats.org/drawingml/2006/picture">
+            <wp:extent cx="6035040" cy="1523460"/>
+            <wp:docPr id="2" name="Picture 2"/>
+            <wp:cNvGraphicFramePr>
+              <a:graphicFrameLocks noChangeAspect="1"/>
+            </wp:cNvGraphicFramePr>
+            <a:graphic>
+              <a:graphicData uri="http://schemas.openxmlformats.org/drawingml/2006/picture">
+                <pic:pic>
+                  <pic:nvPicPr>
+                    <pic:cNvPr id="0" name="sweep_crop.png"/>
+                    <pic:cNvPicPr/>
+                  </pic:nvPicPr>
+                  <pic:blipFill>
+                    <a:blip r:embed="rId18"/>
+                    <a:stretch>
+                      <a:fillRect/>
+                    </a:stretch>
+                  </pic:blipFill>
+                  <pic:spPr>
+                    <a:xfrm>
+                      <a:off x="0" y="0"/>
+                      <a:ext cx="6035040" cy="1523460"/>
+                    </a:xfrm>
+                    <a:prstGeom prst="rect"/>
+                  </pic:spPr>
+                </pic:pic>
+              </a:graphicData>
+            </a:graphic>
+          </wp:inline>
+        </w:drawing>
+      </w:r>
+    </w:p>
+    <w:p>
+      <w:pPr>
+        <w:spacing w:after="160" w:before="0"/>
+        <w:jc w:val="center"/>
+      </w:pPr>
+      <w:r>
+        <w:rPr>
+          <w:rFonts w:ascii="Calibri" w:cs="Calibri" w:eastAsia="Calibri" w:hAnsi="Calibri"/>
+          <w:i/>
+          <w:iCs/>
+          <w:sz w:val="18"/>
+          <w:szCs w:val="18"/>
+        </w:rPr>
+        <w:t xml:space="preserve">Figure 9: Terminal screenshot: the Track A sweep completing (120/120 conditions, 600 rows) and the reproducibility check returning True.</w:t>
       </w:r>
     </w:p>
     <w:p>
@@ -8412,7 +8373,7 @@
           <w:sz w:val="22"/>
           <w:szCs w:val="22"/>
         </w:rPr>
-        <w:t xml:space="preserve">Sample output:</w:t>
+        <w:t xml:space="preserve">Code.</w:t>
       </w:r>
       <w:r>
         <w:rPr>
@@ -8420,7 +8381,88 @@
           <w:sz w:val="22"/>
           <w:szCs w:val="22"/>
         </w:rPr>
-        <w:t xml:space="preserve"> the interactive results dashboard built from the result files, deployed at https://quantum-error-mitigation-bench.vercel.app.</w:t>
+        <w:t xml:space="preserve"> The noise-model builder as it appears in the public repository (Section 4.3 discusses it).</w:t>
+      </w:r>
+    </w:p>
+    <w:p>
+      <w:pPr>
+        <w:keepNext/>
+        <w:spacing w:after="40" w:before="0"/>
+        <w:jc w:val="center"/>
+      </w:pPr>
+      <w:r>
+        <w:drawing>
+          <wp:inline xmlns:a="http://schemas.openxmlformats.org/drawingml/2006/main" xmlns:pic="http://schemas.openxmlformats.org/drawingml/2006/picture">
+            <wp:extent cx="5669280" cy="5235998"/>
+            <wp:docPr id="2" name="Picture 2"/>
+            <wp:cNvGraphicFramePr>
+              <a:graphicFrameLocks noChangeAspect="1"/>
+            </wp:cNvGraphicFramePr>
+            <a:graphic>
+              <a:graphicData uri="http://schemas.openxmlformats.org/drawingml/2006/picture">
+                <pic:pic>
+                  <pic:nvPicPr>
+                    <pic:cNvPr id="0" name="github_noise_crop.png"/>
+                    <pic:cNvPicPr/>
+                  </pic:nvPicPr>
+                  <pic:blipFill>
+                    <a:blip r:embed="rId19"/>
+                    <a:stretch>
+                      <a:fillRect/>
+                    </a:stretch>
+                  </pic:blipFill>
+                  <pic:spPr>
+                    <a:xfrm>
+                      <a:off x="0" y="0"/>
+                      <a:ext cx="5669280" cy="5235998"/>
+                    </a:xfrm>
+                    <a:prstGeom prst="rect"/>
+                  </pic:spPr>
+                </pic:pic>
+              </a:graphicData>
+            </a:graphic>
+          </wp:inline>
+        </w:drawing>
+      </w:r>
+    </w:p>
+    <w:p>
+      <w:pPr>
+        <w:spacing w:after="160" w:before="0"/>
+        <w:jc w:val="center"/>
+      </w:pPr>
+      <w:r>
+        <w:rPr>
+          <w:rFonts w:ascii="Calibri" w:cs="Calibri" w:eastAsia="Calibri" w:hAnsi="Calibri"/>
+          <w:i/>
+          <w:iCs/>
+          <w:sz w:val="18"/>
+          <w:szCs w:val="18"/>
+        </w:rPr>
+        <w:t xml:space="preserve">Figure 10: Code screenshot: build_noise_model in src/qem/noise.py on GitHub.</w:t>
+      </w:r>
+    </w:p>
+    <w:p>
+      <w:pPr>
+        <w:keepNext/>
+        <w:spacing w:after="80" w:before="0"/>
+      </w:pPr>
+      <w:r>
+        <w:rPr>
+          <w:rFonts w:ascii="Calibri" w:cs="Calibri" w:eastAsia="Calibri" w:hAnsi="Calibri"/>
+          <w:b/>
+          <w:bCs/>
+          <w:sz w:val="22"/>
+          <w:szCs w:val="22"/>
+        </w:rPr>
+        <w:t xml:space="preserve">Sample output.</w:t>
+      </w:r>
+      <w:r>
+        <w:rPr>
+          <w:rFonts w:ascii="Calibri" w:cs="Calibri" w:eastAsia="Calibri" w:hAnsi="Calibri"/>
+          <w:sz w:val="22"/>
+          <w:szCs w:val="22"/>
+        </w:rPr>
+        <w:t xml:space="preserve"> The interactive results dashboard, built from the result files and deployed at https://quantum-error-mitigation-bench.vercel.app.</w:t>
       </w:r>
     </w:p>
     <w:p>
@@ -8445,7 +8487,7 @@
                     <pic:cNvPicPr/>
                   </pic:nvPicPr>
                   <pic:blipFill>
-                    <a:blip r:embed="rId17"/>
+                    <a:blip r:embed="rId20"/>
                     <a:stretch>
                       <a:fillRect/>
                     </a:stretch>
@@ -8477,7 +8519,7 @@
           <w:sz w:val="18"/>
           <w:szCs w:val="18"/>
         </w:rPr>
-        <w:t xml:space="preserve">Figure 8: Screenshot of the deployed results dashboard: headline numbers, error by method and noise level, and the improvement map.</w:t>
+        <w:t xml:space="preserve">Figure 11: Screenshot of the deployed results dashboard: headline numbers, error by method and noise level, and the improvement map.</w:t>
       </w:r>
     </w:p>
     <w:p>
@@ -15665,7 +15707,7 @@
           <w:sz w:val="22"/>
           <w:szCs w:val="22"/>
         </w:rPr>
-        <w:t xml:space="preserve">Figure 9 shows the error of every method for each (n, L) at N0–N2 (the N3 stress level is reported separately, in Tables 2 and 4 and results/summary/table_error.md). At N2, every mitigated method is below the baseline in every (n, L) cell; at N0, the ZNE-based methods are worse than the baseline in every cell. Pooled over all circuits, the unmitigated error rises from 0.021 (N0) to 0.062 (N1), 0.181 (N2) and 0.310 (N3). Figure 10 shows the error against qubit count at N2 for each depth, and Figure 11 gives the median improvement for every (n, L) cell at N1 and N2.</w:t>
+        <w:t xml:space="preserve">Figure 12 shows the error of every method for each (n, L) at N0–N2 (the N3 stress level is reported separately, in Tables 2 and 4 and results/summary/table_error.md). At N2, every mitigated method is below the baseline in every (n, L) cell; at N0, the ZNE-based methods are worse than the baseline in every cell. Pooled over all circuits, the unmitigated error rises from 0.021 (N0) to 0.062 (N1), 0.181 (N2) and 0.310 (N3). Figure 13 shows the error against qubit count at N2 for each depth, and Figure 14 gives the median improvement for every (n, L) cell at N1 and N2.</w:t>
       </w:r>
     </w:p>
     <w:p>
@@ -15690,7 +15732,7 @@
                     <pic:cNvPicPr/>
                   </pic:nvPicPr>
                   <pic:blipFill>
-                    <a:blip r:embed="rId18"/>
+                    <a:blip r:embed="rId21"/>
                     <a:stretch>
                       <a:fillRect/>
                     </a:stretch>
@@ -15722,7 +15764,7 @@
           <w:sz w:val="18"/>
           <w:szCs w:val="18"/>
         </w:rPr>
-        <w:t xml:space="preserve">Figure 9: Absolute parity error (mean ± SD over 5 seeds) by noise level (N0–N2) and method, one panel per (n, L); dashed line: mean shot-noise floor.</w:t>
+        <w:t xml:space="preserve">Figure 12: Absolute parity error (mean ± SD over 5 seeds) by noise level (N0–N2) and method, one panel per (n, L); dashed line: mean shot-noise floor.</w:t>
       </w:r>
     </w:p>
     <w:p>
@@ -15747,7 +15789,7 @@
                     <pic:cNvPicPr/>
                   </pic:nvPicPr>
                   <pic:blipFill>
-                    <a:blip r:embed="rId19"/>
+                    <a:blip r:embed="rId22"/>
                     <a:stretch>
                       <a:fillRect/>
                     </a:stretch>
@@ -15779,7 +15821,7 @@
           <w:sz w:val="18"/>
           <w:szCs w:val="18"/>
         </w:rPr>
-        <w:t xml:space="preserve">Figure 10: Absolute error vs. qubit count at N2, one panel per depth (mean ± SD over 5 seeds).</w:t>
+        <w:t xml:space="preserve">Figure 13: Absolute error vs. qubit count at N2, one panel per depth (mean ± SD over 5 seeds).</w:t>
       </w:r>
     </w:p>
     <w:p>
@@ -15804,7 +15846,7 @@
                     <pic:cNvPicPr/>
                   </pic:nvPicPr>
                   <pic:blipFill>
-                    <a:blip r:embed="rId20"/>
+                    <a:blip r:embed="rId23"/>
                     <a:stretch>
                       <a:fillRect/>
                     </a:stretch>
@@ -15836,7 +15878,7 @@
           <w:sz w:val="18"/>
           <w:szCs w:val="18"/>
         </w:rPr>
-        <w:t xml:space="preserve">Figure 11: Median improvement over no mitigation (%) for every (n, L) cell at N1 and N2 (5 seeds per cell).</w:t>
+        <w:t xml:space="preserve">Figure 14: Median improvement over no mitigation (%) for every (n, L) cell at N1 and N2 (5 seeds per cell).</w:t>
       </w:r>
     </w:p>
     <w:p>
@@ -15849,7 +15891,7 @@
           <w:sz w:val="22"/>
           <w:szCs w:val="22"/>
         </w:rPr>
-        <w:t xml:space="preserve">Figure 12 compares the measured output distribution with the exact one for one circuit (n = 4, L = 4, N2, seed 0): noise spreads probability away from the most likely outcomes, and REM (full and tensored) moves it back. Figures 13 and 14 quantify this over the grid: at N2, REM raises Hellinger fidelity in 6/6 (n, L) cells (mean gain 0.0160) and raises the success-probability ratio toward 1.</w:t>
+        <w:t xml:space="preserve">Figure 15 compares the measured output distribution with the exact one for one circuit (n = 4, L = 4, N2, seed 0): noise spreads probability away from the most likely outcomes, and REM (full and tensored) moves it back. Figures 16 and 17 quantify this over the grid: at N2, REM raises Hellinger fidelity in 6/6 (n, L) cells (mean gain 0.0160) and raises the success-probability ratio toward 1.</w:t>
       </w:r>
     </w:p>
     <w:p>
@@ -15874,7 +15916,7 @@
                     <pic:cNvPicPr/>
                   </pic:nvPicPr>
                   <pic:blipFill>
-                    <a:blip r:embed="rId21"/>
+                    <a:blip r:embed="rId24"/>
                     <a:stretch>
                       <a:fillRect/>
                     </a:stretch>
@@ -15906,7 +15948,7 @@
           <w:sz w:val="18"/>
           <w:szCs w:val="18"/>
         </w:rPr>
-        <w:t xml:space="preserve">Figure 12: Output distribution for n = 4, L = 4, N2, seed 0: exact, unmitigated, full REM and tensored REM.</w:t>
+        <w:t xml:space="preserve">Figure 15: Output distribution for n = 4, L = 4, N2, seed 0: exact, unmitigated, full REM and tensored REM.</w:t>
       </w:r>
     </w:p>
     <w:p>
@@ -15931,7 +15973,7 @@
                     <pic:cNvPicPr/>
                   </pic:nvPicPr>
                   <pic:blipFill>
-                    <a:blip r:embed="rId22"/>
+                    <a:blip r:embed="rId25"/>
                     <a:stretch>
                       <a:fillRect/>
                     </a:stretch>
@@ -15963,7 +16005,7 @@
           <w:sz w:val="18"/>
           <w:szCs w:val="18"/>
         </w:rPr>
-        <w:t xml:space="preserve">Figure 13: Hellinger infidelity (1 − F) by noise level (N0–N2): no mitigation vs. full and tensored REM, one panel per (n, L).</w:t>
+        <w:t xml:space="preserve">Figure 16: Hellinger infidelity (1 − F) by noise level (N0–N2): no mitigation vs. full and tensored REM, one panel per (n, L).</w:t>
       </w:r>
     </w:p>
     <w:p>
@@ -15988,7 +16030,7 @@
                     <pic:cNvPicPr/>
                   </pic:nvPicPr>
                   <pic:blipFill>
-                    <a:blip r:embed="rId23"/>
+                    <a:blip r:embed="rId26"/>
                     <a:stretch>
                       <a:fillRect/>
                     </a:stretch>
@@ -16020,7 +16062,7 @@
           <w:sz w:val="18"/>
           <w:szCs w:val="18"/>
         </w:rPr>
-        <w:t xml:space="preserve">Figure 14: Success-probability ratio P_succ_hat / P_succ_exact (1 = exact) by noise level (N0–N2) and method, one panel per (n, L).</w:t>
+        <w:t xml:space="preserve">Figure 17: Success-probability ratio P_succ_hat / P_succ_exact (1 = exact) by noise level (N0–N2) and method, one panel per (n, L).</w:t>
       </w:r>
     </w:p>
     <w:p>
@@ -16033,7 +16075,7 @@
           <w:sz w:val="22"/>
           <w:szCs w:val="22"/>
         </w:rPr>
-        <w:t xml:space="preserve">Figure 15 shows the ZNE extrapolation for one circuit (n = 4, L = 4, N2, seed 0; exact parity 0.408, unmitigated 0.197). Extrapolating the raw points (ZNE) gives 0.256, still short of the exact value, partly because readout error is not folded; extrapolating the REM-corrected points (ZNE+REM) gives 0.325, closer but not exact. Figure 16 shows the bias–spread trade-off at N2, pooled over all circuits: unmitigated estimates are shrunk toward 0 (median oriented error −0.183); REM, tensored REM and ZNE each remove about half of that shrinkage (medians −0.093, −0.091, −0.098); only ZNE+REM is centred near zero (+0.015), and the ZNE-based methods have the widest spread (SD 0.072 and 0.080, against 0.059 with no mitigation).</w:t>
+        <w:t xml:space="preserve">Figure 18 shows the ZNE extrapolation for one circuit (n = 4, L = 4, N2, seed 0; exact parity 0.408, unmitigated 0.197). Extrapolating the raw points (ZNE) gives 0.256, still short of the exact value, partly because readout error is not folded; extrapolating the REM-corrected points (ZNE+REM) gives 0.325, closer but not exact. Figure 19 shows the bias–spread trade-off at N2, pooled over all circuits: unmitigated estimates are shrunk toward 0 (median oriented error −0.183); REM, tensored REM and ZNE each remove about half of that shrinkage (medians −0.093, −0.091, −0.098); only ZNE+REM is centred near zero (+0.015), and the ZNE-based methods have the widest spread (SD 0.072 and 0.080, against 0.059 with no mitigation).</w:t>
       </w:r>
     </w:p>
     <w:p>
@@ -16058,7 +16100,7 @@
                     <pic:cNvPicPr/>
                   </pic:nvPicPr>
                   <pic:blipFill>
-                    <a:blip r:embed="rId24"/>
+                    <a:blip r:embed="rId27"/>
                     <a:stretch>
                       <a:fillRect/>
                     </a:stretch>
@@ -16090,7 +16132,7 @@
           <w:sz w:val="18"/>
           <w:szCs w:val="18"/>
         </w:rPr>
-        <w:t xml:space="preserve">Figure 15: ZNE extrapolation for n = 4, L = 4, N2, seed 0: raw counts (ZNE) vs. REM-corrected counts (ZNE+REM).</w:t>
+        <w:t xml:space="preserve">Figure 18: ZNE extrapolation for n = 4, L = 4, N2, seed 0: raw counts (ZNE) vs. REM-corrected counts (ZNE+REM).</w:t>
       </w:r>
     </w:p>
     <w:p>
@@ -16115,7 +16157,7 @@
                     <pic:cNvPicPr/>
                   </pic:nvPicPr>
                   <pic:blipFill>
-                    <a:blip r:embed="rId25"/>
+                    <a:blip r:embed="rId28"/>
                     <a:stretch>
                       <a:fillRect/>
                     </a:stretch>
@@ -16147,7 +16189,7 @@
           <w:sz w:val="18"/>
           <w:szCs w:val="18"/>
         </w:rPr>
-        <w:t xml:space="preserve">Figure 16: Bias and spread at N2, pooled over n, L and seeds: signed error (left) and error oriented so that negative means shrunk toward 0 (right).</w:t>
+        <w:t xml:space="preserve">Figure 19: Bias and spread at N2, pooled over n, L and seeds: signed error (left) and error oriented so that negative means shrunk toward 0 (right).</w:t>
       </w:r>
     </w:p>
     <w:p>
@@ -16160,7 +16202,7 @@
           <w:sz w:val="22"/>
           <w:szCs w:val="22"/>
         </w:rPr>
-        <w:t xml:space="preserve">For Track B, Figure 17 shows that VQC accuracy barely moves with noise (N0–N3) and stays close to Logistic Regression and SVM. Figures 18 and 19 show what accuracy hides: the mean expectation error grows with noise, and for n = 4, L = 2 the outputs shrink toward 0 at N2 and N3, mostly without changing sign, while ZNE+REM pulls them back toward the diagonal. Figure 20 shows the noiseless training curves.</w:t>
+        <w:t xml:space="preserve">For Track B, Figure 20 shows that VQC accuracy barely moves with noise (N0–N3) and stays close to Logistic Regression and SVM. Figures 21 and 22 show what accuracy hides: the mean expectation error grows with noise, and for n = 4, L = 2 the outputs shrink toward 0 at N2 and N3, mostly without changing sign, while ZNE+REM pulls them back toward the diagonal. Figure 23 shows the noiseless training curves.</w:t>
       </w:r>
     </w:p>
     <w:p>
@@ -16185,7 +16227,7 @@
                     <pic:cNvPicPr/>
                   </pic:nvPicPr>
                   <pic:blipFill>
-                    <a:blip r:embed="rId26"/>
+                    <a:blip r:embed="rId29"/>
                     <a:stretch>
                       <a:fillRect/>
                     </a:stretch>
@@ -16217,7 +16259,7 @@
           <w:sz w:val="18"/>
           <w:szCs w:val="18"/>
         </w:rPr>
-        <w:t xml:space="preserve">Figure 17: VQC test accuracy vs. noise level (N0–N3) by method, one panel per (n, L) (mean ± SD over 5 seeds); Logistic Regression and SVM as horizontal lines.</w:t>
+        <w:t xml:space="preserve">Figure 20: VQC test accuracy vs. noise level (N0–N3) by method, one panel per (n, L) (mean ± SD over 5 seeds); Logistic Regression and SVM as horizontal lines.</w:t>
       </w:r>
     </w:p>
     <w:p>
@@ -16242,7 +16284,7 @@
                     <pic:cNvPicPr/>
                   </pic:nvPicPr>
                   <pic:blipFill>
-                    <a:blip r:embed="rId27"/>
+                    <a:blip r:embed="rId30"/>
                     <a:stretch>
                       <a:fillRect/>
                     </a:stretch>
@@ -16274,7 +16316,7 @@
           <w:sz w:val="18"/>
           <w:szCs w:val="18"/>
         </w:rPr>
-        <w:t xml:space="preserve">Figure 18: Mean |E_hat − E_exact| over the VQC test set vs. noise level, for n = 2 and n = 4 (mean over L).</w:t>
+        <w:t xml:space="preserve">Figure 21: Mean |E_hat − E_exact| over the VQC test set vs. noise level, for n = 2 and n = 4 (mean over L).</w:t>
       </w:r>
     </w:p>
     <w:p>
@@ -16299,7 +16341,7 @@
                     <pic:cNvPicPr/>
                   </pic:nvPicPr>
                   <pic:blipFill>
-                    <a:blip r:embed="rId28"/>
+                    <a:blip r:embed="rId31"/>
                     <a:stretch>
                       <a:fillRect/>
                     </a:stretch>
@@ -16331,7 +16373,7 @@
           <w:sz w:val="18"/>
           <w:szCs w:val="18"/>
         </w:rPr>
-        <w:t xml:space="preserve">Figure 19: E_hat against E_exact for n = 4, L = 2 (100 test predictions pooled over 5 seeds) at N2 and N3, without mitigation and with ZNE+REM; the diagonal is E_hat = E_exact.</w:t>
+        <w:t xml:space="preserve">Figure 22: E_hat against E_exact for n = 4, L = 2 (100 test predictions pooled over 5 seeds) at N2 and N3, without mitigation and with ZNE+REM; the diagonal is E_hat = E_exact.</w:t>
       </w:r>
     </w:p>
     <w:p>
@@ -16356,7 +16398,7 @@
                     <pic:cNvPicPr/>
                   </pic:nvPicPr>
                   <pic:blipFill>
-                    <a:blip r:embed="rId29"/>
+                    <a:blip r:embed="rId32"/>
                     <a:stretch>
                       <a:fillRect/>
                     </a:stretch>
@@ -16388,7 +16430,7 @@
           <w:sz w:val="18"/>
           <w:szCs w:val="18"/>
         </w:rPr>
-        <w:t xml:space="preserve">Figure 20: VQC training curves (noiseless): MSE loss against COBYLA objective evaluations, per (n, L) and seed.</w:t>
+        <w:t xml:space="preserve">Figure 23: VQC training curves (noiseless): MSE loss against COBYLA objective evaluations, per (n, L) and seed.</w:t>
       </w:r>
     </w:p>
     <w:p>
@@ -16401,7 +16443,7 @@
           <w:sz w:val="22"/>
           <w:szCs w:val="22"/>
         </w:rPr>
-        <w:t xml:space="preserve">Figure 21 compares tensored and full REM condition by condition (points on the diagonal agree). Figure 22 compares the empirical standard deviation of the Richardson estimate under uniform and variance-optimal shot allocation at the same 3072-shot budget, averaged over the 5 circuit instances of each condition: the optimal split is lower in 12 of 12 conditions.</w:t>
+        <w:t xml:space="preserve">Figure 24 compares tensored and full REM condition by condition (points on the diagonal agree). Figure 25 compares the empirical standard deviation of the Richardson estimate under uniform and variance-optimal shot allocation at the same 3072-shot budget, averaged over the 5 circuit instances of each condition: the optimal split is lower in 12 of 12 conditions.</w:t>
       </w:r>
     </w:p>
     <w:p>
@@ -16426,7 +16468,7 @@
                     <pic:cNvPicPr/>
                   </pic:nvPicPr>
                   <pic:blipFill>
-                    <a:blip r:embed="rId30"/>
+                    <a:blip r:embed="rId33"/>
                     <a:stretch>
                       <a:fillRect/>
                     </a:stretch>
@@ -16458,7 +16500,7 @@
           <w:sz w:val="18"/>
           <w:szCs w:val="18"/>
         </w:rPr>
-        <w:t xml:space="preserve">Figure 21: Full vs. tensored REM absolute error for every condition at N1–N3 (marker: noise level; colour: qubit count).</w:t>
+        <w:t xml:space="preserve">Figure 24: Full vs. tensored REM absolute error for every condition at N1–N3 (marker: noise level; colour: qubit count).</w:t>
       </w:r>
     </w:p>
     <w:p>
@@ -16483,7 +16525,7 @@
                     <pic:cNvPicPr/>
                   </pic:nvPicPr>
                   <pic:blipFill>
-                    <a:blip r:embed="rId31"/>
+                    <a:blip r:embed="rId34"/>
                     <a:stretch>
                       <a:fillRect/>
                     </a:stretch>
@@ -16515,7 +16557,7 @@
           <w:sz w:val="18"/>
           <w:szCs w:val="18"/>
         </w:rPr>
-        <w:t xml:space="preserve">Figure 22: Empirical std of the Richardson estimate, uniform vs. optimal allocation at 3072 total shots (mean ± SD over the 5 circuit instances of each condition).</w:t>
+        <w:t xml:space="preserve">Figure 25: Empirical std of the Richardson estimate, uniform vs. optimal allocation at 3072 total shots (mean ± SD over the 5 circuit instances of each condition).</w:t>
       </w:r>
     </w:p>
     <w:p>
@@ -17841,7 +17883,7 @@
           <w:sz w:val="22"/>
           <w:szCs w:val="22"/>
         </w:rPr>
-        <w:t xml:space="preserve"> At N2 every method reduces the error (Table 4, Figure 9): median cuts of 43% (REM), 48% (tensored REM), 44% (ZNE) and 68% (ZNE+REM), all significant in pooled Wilcoxon tests. At N1 the picture changes: REM still helps (42%, p = 8.0e-08), but ZNE alone shows no significant benefit (1%, p = 0.984) because its variance amplification outweighs a small gate bias. At the N3 stress level every method still helps (29%, 25%, 19%, 58%) and ZNE+REM stays strongest.</w:t>
+        <w:t xml:space="preserve"> At N2 every method reduces the error (Table 4, Figure 12): median cuts of 43% (REM), 48% (tensored REM), 44% (ZNE) and 68% (ZNE+REM), all significant in pooled Wilcoxon tests. At N1 the picture changes: REM still helps (42%, p = 8.0e-08), but ZNE alone shows no significant benefit (1%, p = 0.984) because its variance amplification outweighs a small gate bias. At the N3 stress level every method still helps (29%, 25%, 19%, 58%) and ZNE+REM stays strongest.</w:t>
       </w:r>
     </w:p>
     <w:p>
@@ -17887,7 +17929,7 @@
           <w:sz w:val="22"/>
           <w:szCs w:val="22"/>
         </w:rPr>
-        <w:t xml:space="preserve"> ZNE's standard deviation is 2.38×, 2.42×, 2.70× and 2.07× the baseline's at N0–N3, against 2.28× predicted by the Richardson weights. Each ratio compares two standard deviations estimated from 30 runs, which carries roughly ±19% relative uncertainty, so these values are consistent with theory. At N0 there is no bias to remove, and ZNE was worse than no mitigation in 26/30 runs (Figure 9).</w:t>
+        <w:t xml:space="preserve"> ZNE's standard deviation is 2.38×, 2.42×, 2.70× and 2.07× the baseline's at N0–N3, against 2.28× predicted by the Richardson weights. Each ratio compares two standard deviations estimated from 30 runs, which carries roughly ±19% relative uncertainty, so these values are consistent with theory. At N0 there is no bias to remove, and ZNE was worse than no mitigation in 26/30 runs (Figure 12).</w:t>
       </w:r>
     </w:p>
     <w:p>
@@ -17910,7 +17952,7 @@
           <w:sz w:val="22"/>
           <w:szCs w:val="22"/>
         </w:rPr>
-        <w:t xml:space="preserve"> Per estimate, full REM needs 1 + 2ⁿ circuits (5/17/65 at n = 2, 4, 6) while tensored REM needs a constant 3; ZNE needs 3 circuits but 9× the CNOTs and up to 5.00× the depth (95 at the deepest); ZNE+REM needs the sum (Figures 23 and 24). Simulator wall time is not hardware time, so circuit and shot counts are the meaningful cost figures.</w:t>
+        <w:t xml:space="preserve"> Per estimate, full REM needs 1 + 2ⁿ circuits (5/17/65 at n = 2, 4, 6) while tensored REM needs a constant 3; ZNE needs 3 circuits but 9× the CNOTs and up to 5.00× the depth (95 at the deepest); ZNE+REM needs the sum (Figures 26 and 27). Simulator wall time is not hardware time, so circuit and shot counts are the meaningful cost figures.</w:t>
       </w:r>
     </w:p>
     <w:p>
@@ -18256,7 +18298,7 @@
                 <w:sz w:val="17"/>
                 <w:szCs w:val="17"/>
               </w:rPr>
-              <w:t xml:space="preserve">Rises with noise level in all 6 (n, L) cells (pooled 0.021 → 0.062 → 0.181 → 0.310). Averaged over the other parameter, error is lowest at n = 2 and higher at L = 4 than L = 2 at N1–N3, but not in every cell: at N2, n = 4, L = 2 has 0.199 vs 0.183 for n = 6, L = 2, because each cell uses different circuit instances (Figures 9 and 10).</w:t>
+              <w:t xml:space="preserve">Rises with noise level in all 6 (n, L) cells (pooled 0.021 → 0.062 → 0.181 → 0.310). Averaged over the other parameter, error is lowest at n = 2 and higher at L = 4 than L = 2 at N1–N3, but not in every cell: at N2, n = 4, L = 2 has 0.199 vs 0.183 for n = 6, L = 2, because each cell uses different circuit instances (Figures 12 and 13).</w:t>
             </w:r>
           </w:p>
         </w:tc>
@@ -18384,7 +18426,7 @@
                 <w:sz w:val="17"/>
                 <w:szCs w:val="17"/>
               </w:rPr>
-              <w:t xml:space="preserve">REM's remaining error at N2 (0.105) is close to the gate part of the bias (0.111); fidelity and P_succ improve (Figures 13 and 14).</w:t>
+              <w:t xml:space="preserve">REM's remaining error at N2 (0.105) is close to the gate part of the bias (0.111); fidelity and P_succ improve (Figures 16 and 17).</w:t>
             </w:r>
           </w:p>
         </w:tc>
@@ -18896,7 +18938,7 @@
                 <w:sz w:val="17"/>
                 <w:szCs w:val="17"/>
               </w:rPr>
-              <w:t xml:space="preserve">Measured 5/17/65, 3/3/3, 3/3/3 and 7/19/67; 9× CNOTs, 5.00× depth (Figure 23).</w:t>
+              <w:t xml:space="preserve">Measured 5/17/65, 3/3/3, 3/3/3 and 7/19/67; 9× CNOTs, 5.00× depth (Figure 26).</w:t>
             </w:r>
           </w:p>
         </w:tc>
@@ -19152,7 +19194,7 @@
                 <w:sz w:val="17"/>
                 <w:szCs w:val="17"/>
               </w:rPr>
-              <w:t xml:space="preserve">N3: margin retention 0.411 → 0.847 with ZNE+REM, accuracy 0.900 → 0.903 (Figures 18 and 19).</w:t>
+              <w:t xml:space="preserve">N3: margin retention 0.411 → 0.847 with ZNE+REM, accuracy 0.900 → 0.903 (Figures 21 and 22).</w:t>
             </w:r>
           </w:p>
         </w:tc>
@@ -19280,7 +19322,7 @@
                 <w:sz w:val="17"/>
                 <w:szCs w:val="17"/>
               </w:rPr>
-              <w:t xml:space="preserve">Mean |difference| 0.0063, max 0.0388 (Figure 21).</w:t>
+              <w:t xml:space="preserve">Mean |difference| 0.0063, max 0.0388 (Figure 24).</w:t>
             </w:r>
           </w:p>
         </w:tc>
@@ -19408,7 +19450,7 @@
                 <w:sz w:val="17"/>
                 <w:szCs w:val="17"/>
               </w:rPr>
-              <w:t xml:space="preserve">Measured ratio 0.874 vs 0.885 predicted (Figure 22).</w:t>
+              <w:t xml:space="preserve">Measured ratio 0.874 vs 0.885 predicted (Figure 25).</w:t>
             </w:r>
           </w:p>
         </w:tc>
@@ -19441,7 +19483,7 @@
                     <pic:cNvPicPr/>
                   </pic:nvPicPr>
                   <pic:blipFill>
-                    <a:blip r:embed="rId32"/>
+                    <a:blip r:embed="rId35"/>
                     <a:stretch>
                       <a:fillRect/>
                     </a:stretch>
@@ -19473,7 +19515,7 @@
           <w:sz w:val="18"/>
           <w:szCs w:val="18"/>
         </w:rPr>
-        <w:t xml:space="preserve">Figure 23: Circuits per estimate vs. qubit count: full REM grows as 1 + 2ⁿ, tensored REM stays at 3.</w:t>
+        <w:t xml:space="preserve">Figure 26: Circuits per estimate vs. qubit count: full REM grows as 1 + 2ⁿ, tensored REM stays at 3.</w:t>
       </w:r>
     </w:p>
     <w:p>
@@ -19498,7 +19540,7 @@
                     <pic:cNvPicPr/>
                   </pic:nvPicPr>
                   <pic:blipFill>
-                    <a:blip r:embed="rId33"/>
+                    <a:blip r:embed="rId36"/>
                     <a:stretch>
                       <a:fillRect/>
                     </a:stretch>
@@ -19530,7 +19572,7 @@
           <w:sz w:val="18"/>
           <w:szCs w:val="18"/>
         </w:rPr>
-        <w:t xml:space="preserve">Figure 24: Cost (total shots per estimate) against benefit (mean error reduction factor), both on log scales, at N1 and N2; dashed line: no improvement.</w:t>
+        <w:t xml:space="preserve">Figure 27: Cost (total shots per estimate) against benefit (mean error reduction factor), both on log scales, at N1 and N2; dashed line: no improvement.</w:t>
       </w:r>
     </w:p>
     <w:p>
@@ -20230,7 +20272,7 @@
                 <w:sz w:val="20"/>
                 <w:szCs w:val="20"/>
               </w:rPr>
-              <w:t xml:space="preserve">Figures 9, 11, 19, 21, 22 and 24; Tables 2, 3, 4 and 5.</w:t>
+              <w:t xml:space="preserve">Figures 12, 14, 22, 24, 25 and 27; Tables 2, 3, 4 and 5.</w:t>
             </w:r>
           </w:p>
         </w:tc>
@@ -20835,7 +20877,7 @@
                 <w:sz w:val="20"/>
                 <w:szCs w:val="20"/>
               </w:rPr>
-              <w:t xml:space="preserve">G Srikaanth (1MS23CY015)</w:t>
+              <w:t xml:space="preserve">G Srikaanth (1MS23CY015): about 70%</w:t>
             </w:r>
           </w:p>
         </w:tc>
@@ -20862,13 +20904,10 @@
             <w:r>
               <w:rPr>
                 <w:rFonts w:ascii="Calibri" w:cs="Calibri" w:eastAsia="Calibri" w:hAnsi="Calibri"/>
-                <w:b/>
-                <w:bCs/>
                 <w:sz w:val="20"/>
                 <w:szCs w:val="20"/>
-                <w:highlight w:val="yellow"/>
-              </w:rPr>
-              <w:t xml:space="preserve">Team to fill</w:t>
+              </w:rPr>
+              <w:t xml:space="preserve">Coding: circuit construction, noise model and executor, full and tensored REM, ZNE (folding and extrapolation), the Track A sweep, the VQC and the shot-allocation experiment. Experiments: ran all Track A, Track B and shot-allocation sweeps. Analysis: statistical tests, figures and cost analysis. Writing: Sections 1 and 3–8 of the report, the results dashboard and the study guide.</w:t>
             </w:r>
           </w:p>
         </w:tc>
@@ -20903,7 +20942,7 @@
                 <w:sz w:val="20"/>
                 <w:szCs w:val="20"/>
               </w:rPr>
-              <w:t xml:space="preserve">Devansh Sharma (1MS23CY014)</w:t>
+              <w:t xml:space="preserve">Devansh Sharma (1MS23CY014): about 30%</w:t>
             </w:r>
           </w:p>
         </w:tc>
@@ -20930,13 +20969,10 @@
             <w:r>
               <w:rPr>
                 <w:rFonts w:ascii="Calibri" w:cs="Calibri" w:eastAsia="Calibri" w:hAnsi="Calibri"/>
-                <w:b/>
-                <w:bCs/>
                 <w:sz w:val="20"/>
                 <w:szCs w:val="20"/>
-                <w:highlight w:val="yellow"/>
-              </w:rPr>
-              <w:t xml:space="preserve">Team to fill</w:t>
+              </w:rPr>
+              <w:t xml:space="preserve">Coding: Iris data loading and preprocessing, the Logistic Regression and SVM baselines, and their unit tests. Experiments: checked the Track B runs and classification metrics. Writing: the literature review (Section 2), limitations and references; proofreading and viva preparation.</w:t>
             </w:r>
           </w:p>
         </w:tc>
@@ -21049,13 +21085,10 @@
             <w:r>
               <w:rPr>
                 <w:rFonts w:ascii="Calibri" w:cs="Calibri" w:eastAsia="Calibri" w:hAnsi="Calibri"/>
-                <w:b/>
-                <w:bCs/>
                 <w:sz w:val="20"/>
                 <w:szCs w:val="20"/>
-                <w:highlight w:val="yellow"/>
-              </w:rPr>
-              <w:t xml:space="preserve">Team to complete: list every AI tool used, including code assistants, and its purpose</w:t>
+              </w:rPr>
+              <w:t xml:space="preserve">Claude Code (Anthropic), an AI coding assistant: used to help write and debug the Python code, run the experiment scripts, and draft the report text and documentation. Every reported number is produced by the project's code from the actual runs (results/ in the repository).</w:t>
             </w:r>
           </w:p>
         </w:tc>
@@ -21120,12 +21153,28 @@
             <w:r>
               <w:rPr>
                 <w:rFonts w:ascii="Calibri" w:cs="Calibri" w:eastAsia="Calibri" w:hAnsi="Calibri"/>
-                <w:b w:val="false"/>
-                <w:bCs w:val="false"/>
                 <w:sz w:val="20"/>
                 <w:szCs w:val="20"/>
               </w:rPr>
-              <w:t xml:space="preserve"/>
+              <w:t xml:space="preserve">G Srikaanth: ______________________________</w:t>
+            </w:r>
+          </w:p>
+          <w:p>
+            <w:pPr>
+              <w:spacing w:after="20"/>
+            </w:pPr>
+          </w:p>
+          <w:p>
+            <w:pPr>
+              <w:spacing w:after="20"/>
+            </w:pPr>
+            <w:r>
+              <w:rPr>
+                <w:rFonts w:ascii="Calibri" w:cs="Calibri" w:eastAsia="Calibri" w:hAnsi="Calibri"/>
+                <w:sz w:val="20"/>
+                <w:szCs w:val="20"/>
+              </w:rPr>
+              <w:t xml:space="preserve">Devansh Sharma: ___________________________</w:t>
             </w:r>
           </w:p>
         </w:tc>
@@ -21164,7 +21213,7 @@
           <w:sz w:val="22"/>
           <w:szCs w:val="22"/>
         </w:rPr>
-        <w:t xml:space="preserve">☐  Report in PDF format (file name: Group20_Quantum_Report.pdf)</w:t>
+        <w:t xml:space="preserve">☑  Report in PDF format (file name: Group20_Quantum_Report.pdf)</w:t>
       </w:r>
     </w:p>
     <w:p>
@@ -21200,7 +21249,7 @@
           <w:sz w:val="22"/>
           <w:szCs w:val="22"/>
         </w:rPr>
-        <w:t xml:space="preserve">☐  Circuit diagrams and screenshots are legible</w:t>
+        <w:t xml:space="preserve">☑  Circuit diagrams and screenshots are legible</w:t>
       </w:r>
     </w:p>
     <w:p>
@@ -22332,7 +22381,7 @@
       <w:footerReference w:type="default" r:id="rId8"/>
       <w:pgSz w:w="11906" w:h="16838" w:orient="portrait"/>
       <w:pgMar w:top="1200" w:right="1000" w:bottom="1100" w:left="1000" w:header="708" w:footer="708" w:gutter="0"/>
-      <w:pgNumType/>
+      <w:pgNumType w:start="1"/>
       <w:docGrid w:linePitch="360"/>
     </w:sectPr>
   </w:body>

</xml_diff>

<commit_message>
Drop work-split percentages from the report and shorten the AI-tool declaration
</commit_message>
<xml_diff>
--- a/dashboard/quantum-error-mitigation-bench/Group20_Report.docx
+++ b/dashboard/quantum-error-mitigation-bench/Group20_Report.docx
@@ -427,7 +427,7 @@
                 <w:sz w:val="20"/>
                 <w:szCs w:val="20"/>
               </w:rPr>
-              <w:t xml:space="preserve">Project lead (about 70% of the work): Track A testbed and mitigation methods, VQC, all experiment runs, analysis and report writing</w:t>
+              <w:t xml:space="preserve">Project lead: Track A testbed and mitigation methods, VQC, all experiment runs, analysis and report writing</w:t>
             </w:r>
           </w:p>
         </w:tc>
@@ -552,7 +552,7 @@
                 <w:sz w:val="20"/>
                 <w:szCs w:val="20"/>
               </w:rPr>
-              <w:t xml:space="preserve">Team member (about 30% of the work): Iris preprocessing and LR/SVM baselines, literature review, testing and report review</w:t>
+              <w:t xml:space="preserve">Team member: Iris preprocessing and LR/SVM baselines, literature review, testing and report review</w:t>
             </w:r>
           </w:p>
         </w:tc>
@@ -20877,7 +20877,7 @@
                 <w:sz w:val="20"/>
                 <w:szCs w:val="20"/>
               </w:rPr>
-              <w:t xml:space="preserve">G Srikaanth (1MS23CY015): about 70%</w:t>
+              <w:t xml:space="preserve">G Srikaanth (1MS23CY015)</w:t>
             </w:r>
           </w:p>
         </w:tc>
@@ -20942,7 +20942,7 @@
                 <w:sz w:val="20"/>
                 <w:szCs w:val="20"/>
               </w:rPr>
-              <w:t xml:space="preserve">Devansh Sharma (1MS23CY014): about 30%</w:t>
+              <w:t xml:space="preserve">Devansh Sharma (1MS23CY014)</w:t>
             </w:r>
           </w:p>
         </w:tc>
@@ -21088,7 +21088,7 @@
                 <w:sz w:val="20"/>
                 <w:szCs w:val="20"/>
               </w:rPr>
-              <w:t xml:space="preserve">Claude Code (Anthropic), an AI coding assistant: used to help write and debug the Python code, run the experiment scripts, and draft the report text and documentation. Every reported number is produced by the project's code from the actual runs (results/ in the repository).</w:t>
+              <w:t xml:space="preserve">Claude</w:t>
             </w:r>
           </w:p>
         </w:tc>

</xml_diff>